<commit_message>
Stage 2: PTCF Prompt with Attached Vibecoding Documents
</commit_message>
<xml_diff>
--- a/submission/report.docx
+++ b/submission/report.docx
@@ -3289,19 +3289,7 @@
           <w:rPr>
             <w:rStyle w:val="Hyperlink"/>
           </w:rPr>
-          <w:t>li</w:t>
-        </w:r>
-        <w:r>
-          <w:rPr>
-            <w:rStyle w:val="Hyperlink"/>
-          </w:rPr>
-          <w:t>n</w:t>
-        </w:r>
-        <w:r>
-          <w:rPr>
-            <w:rStyle w:val="Hyperlink"/>
-          </w:rPr>
-          <w:t>k</w:t>
+          <w:t>link</w:t>
         </w:r>
       </w:hyperlink>
       <w:r>
@@ -3347,7 +3335,13 @@
         <w:pStyle w:val="Normal1"/>
       </w:pPr>
       <w:r>
-        <w:t>These documents strengthened by PTCF prompt by giving each part more detail.</w:t>
+        <w:t xml:space="preserve">These documents strengthened </w:t>
+      </w:r>
+      <w:r>
+        <w:t>my</w:t>
+      </w:r>
+      <w:r>
+        <w:t xml:space="preserve"> PTCF prompt by giving each part more detail.</w:t>
       </w:r>
     </w:p>
     <w:p>
@@ -3441,35 +3435,46 @@
       </w:r>
     </w:p>
     <w:p>
-      <w:pPr>
+      <w:r>
+        <w:t xml:space="preserve"> </w:t>
+      </w:r>
+    </w:p>
+    <w:p>
+      <w:pPr>
+        <w:spacing w:line="276" w:lineRule="auto"/>
+        <w:rPr>
+          <w:rFonts w:ascii="Arial" w:hAnsi="Arial" w:cs="Arial"/>
+          <w:sz w:val="22"/>
+          <w:szCs w:val="22"/>
+        </w:rPr>
+      </w:pPr>
+      <w:r>
         <w:rPr>
           <w:rFonts w:ascii="Arial" w:hAnsi="Arial" w:cs="Arial"/>
           <w:b/>
-          <w:i/>
-          <w:iCs/>
-        </w:rPr>
-      </w:pPr>
-    </w:p>
-    <w:p>
-      <w:pPr>
-        <w:pStyle w:val="BodyText"/>
-        <w:jc w:val="both"/>
+          <w:bCs/>
+          <w:sz w:val="22"/>
+          <w:szCs w:val="22"/>
+        </w:rPr>
+        <w:t>The Diagnostic Log:</w:t>
+      </w:r>
+      <w:r>
         <w:rPr>
           <w:rFonts w:ascii="Arial" w:hAnsi="Arial" w:cs="Arial"/>
-          <w:b/>
-        </w:rPr>
-      </w:pPr>
-      <w:r>
+          <w:sz w:val="22"/>
+          <w:szCs w:val="22"/>
+        </w:rPr>
+        <w:t xml:space="preserve"> </w:t>
+      </w:r>
+    </w:p>
+    <w:p>
+      <w:pPr>
+        <w:spacing w:line="276" w:lineRule="auto"/>
         <w:rPr>
           <w:rFonts w:ascii="Arial" w:hAnsi="Arial" w:cs="Arial"/>
-          <w:b/>
-        </w:rPr>
-        <w:t>Explaining my Prompting Approach</w:t>
-      </w:r>
-    </w:p>
-    <w:p>
-      <w:pPr>
-        <w:pStyle w:val="Normal1"/>
+          <w:sz w:val="22"/>
+          <w:szCs w:val="22"/>
+        </w:rPr>
       </w:pPr>
     </w:p>
     <w:p>
@@ -3541,10 +3546,18 @@
         <w:pStyle w:val="Normal1"/>
       </w:pPr>
       <w:r>
-        <w:t>I created six planning documents before using Codex.</w:t>
-      </w:r>
-      <w:r>
-        <w:t xml:space="preserve"> The documents can be found in the GitHub Repository.</w:t>
+        <w:t xml:space="preserve">I created six planning documents before using Codex. The documents can be found in the </w:t>
+      </w:r>
+      <w:hyperlink r:id="rId23" w:history="1">
+        <w:r>
+          <w:rPr>
+            <w:rStyle w:val="Hyperlink"/>
+          </w:rPr>
+          <w:t>GitHub Repository</w:t>
+        </w:r>
+      </w:hyperlink>
+      <w:r>
+        <w:t>.</w:t>
       </w:r>
     </w:p>
     <w:p>
@@ -4164,7 +4177,13 @@
         <w:pStyle w:val="Normal1"/>
       </w:pPr>
       <w:r>
-        <w:t>These documents strengthened by PTCF prompt by giving each part more detail.</w:t>
+        <w:t xml:space="preserve">These documents strengthened </w:t>
+      </w:r>
+      <w:r>
+        <w:t>my</w:t>
+      </w:r>
+      <w:r>
+        <w:t xml:space="preserve"> PTCF prompt by giving each part more detail.</w:t>
       </w:r>
     </w:p>
     <w:p>
@@ -4651,16 +4670,2329 @@
       </w:pPr>
     </w:p>
     <w:p>
-      <w:r>
+      <w:pPr>
+        <w:pStyle w:val="Heading3"/>
+      </w:pPr>
+      <w:r>
+        <w:t>Stage 1: Zero Shot</w:t>
+      </w:r>
+    </w:p>
+    <w:p/>
+    <w:p>
+      <w:pPr>
+        <w:pStyle w:val="Normal1"/>
+      </w:pPr>
+      <w:r>
+        <w:rPr>
+          <w:noProof/>
+        </w:rPr>
+        <w:drawing>
+          <wp:inline distT="0" distB="0" distL="0" distR="0" wp14:anchorId="2B478141" wp14:editId="65F24175">
+            <wp:extent cx="5608320" cy="1362075"/>
+            <wp:effectExtent l="0" t="0" r="0" b="9525"/>
+            <wp:docPr id="300839698" name="Picture 1"/>
+            <wp:cNvGraphicFramePr>
+              <a:graphicFrameLocks xmlns:a="http://schemas.openxmlformats.org/drawingml/2006/main" noChangeAspect="1"/>
+            </wp:cNvGraphicFramePr>
+            <a:graphic xmlns:a="http://schemas.openxmlformats.org/drawingml/2006/main">
+              <a:graphicData uri="http://schemas.openxmlformats.org/drawingml/2006/picture">
+                <pic:pic xmlns:pic="http://schemas.openxmlformats.org/drawingml/2006/picture">
+                  <pic:nvPicPr>
+                    <pic:cNvPr id="300839698" name=""/>
+                    <pic:cNvPicPr/>
+                  </pic:nvPicPr>
+                  <pic:blipFill>
+                    <a:blip r:embed="rId24"/>
+                    <a:stretch>
+                      <a:fillRect/>
+                    </a:stretch>
+                  </pic:blipFill>
+                  <pic:spPr>
+                    <a:xfrm>
+                      <a:off x="0" y="0"/>
+                      <a:ext cx="5608320" cy="1362075"/>
+                    </a:xfrm>
+                    <a:prstGeom prst="rect">
+                      <a:avLst/>
+                    </a:prstGeom>
+                  </pic:spPr>
+                </pic:pic>
+              </a:graphicData>
+            </a:graphic>
+          </wp:inline>
+        </w:drawing>
+      </w:r>
+    </w:p>
+    <w:p>
+      <w:pPr>
+        <w:spacing w:line="276" w:lineRule="auto"/>
+        <w:jc w:val="center"/>
+        <w:rPr>
+          <w:rFonts w:ascii="Arial" w:hAnsi="Arial" w:cs="Arial"/>
+          <w:sz w:val="22"/>
+          <w:szCs w:val="22"/>
+        </w:rPr>
+      </w:pPr>
+      <w:r>
+        <w:rPr>
+          <w:rFonts w:ascii="Arial" w:hAnsi="Arial" w:cs="Arial"/>
+          <w:sz w:val="22"/>
+          <w:szCs w:val="22"/>
+        </w:rPr>
+        <w:t xml:space="preserve">Zero-shot prompt </w:t>
+      </w:r>
+      <w:proofErr w:type="gramStart"/>
+      <w:r>
+        <w:rPr>
+          <w:rFonts w:ascii="Arial" w:hAnsi="Arial" w:cs="Arial"/>
+          <w:sz w:val="22"/>
+          <w:szCs w:val="22"/>
+        </w:rPr>
+        <w:t>entered into</w:t>
+      </w:r>
+      <w:proofErr w:type="gramEnd"/>
+      <w:r>
+        <w:rPr>
+          <w:rFonts w:ascii="Arial" w:hAnsi="Arial" w:cs="Arial"/>
+          <w:sz w:val="22"/>
+          <w:szCs w:val="22"/>
+        </w:rPr>
+        <w:t xml:space="preserve"> Codex</w:t>
+      </w:r>
+    </w:p>
+    <w:p>
+      <w:pPr>
+        <w:spacing w:line="276" w:lineRule="auto"/>
+        <w:jc w:val="center"/>
+        <w:rPr>
+          <w:rFonts w:ascii="Arial" w:hAnsi="Arial" w:cs="Arial"/>
+          <w:sz w:val="22"/>
+          <w:szCs w:val="22"/>
+        </w:rPr>
+      </w:pPr>
+    </w:p>
+    <w:p>
+      <w:pPr>
+        <w:spacing w:line="276" w:lineRule="auto"/>
+        <w:jc w:val="center"/>
+        <w:rPr>
+          <w:rFonts w:ascii="Arial" w:hAnsi="Arial" w:cs="Arial"/>
+          <w:sz w:val="22"/>
+          <w:szCs w:val="22"/>
+        </w:rPr>
+      </w:pPr>
+    </w:p>
+    <w:p>
+      <w:pPr>
+        <w:spacing w:line="276" w:lineRule="auto"/>
+        <w:jc w:val="center"/>
+        <w:rPr>
+          <w:rFonts w:ascii="Arial" w:hAnsi="Arial" w:cs="Arial"/>
+          <w:sz w:val="22"/>
+          <w:szCs w:val="22"/>
+        </w:rPr>
+      </w:pPr>
+      <w:r>
+        <w:rPr>
+          <w:rFonts w:ascii="Arial" w:hAnsi="Arial" w:cs="Arial"/>
+          <w:noProof/>
+          <w:sz w:val="22"/>
+          <w:szCs w:val="22"/>
+        </w:rPr>
+        <w:drawing>
+          <wp:inline distT="0" distB="0" distL="0" distR="0" wp14:anchorId="4C747C27" wp14:editId="6B2496CD">
+            <wp:extent cx="5608320" cy="4668520"/>
+            <wp:effectExtent l="0" t="0" r="0" b="0"/>
+            <wp:docPr id="1768772135" name="Picture 1"/>
+            <wp:cNvGraphicFramePr>
+              <a:graphicFrameLocks xmlns:a="http://schemas.openxmlformats.org/drawingml/2006/main" noChangeAspect="1"/>
+            </wp:cNvGraphicFramePr>
+            <a:graphic xmlns:a="http://schemas.openxmlformats.org/drawingml/2006/main">
+              <a:graphicData uri="http://schemas.openxmlformats.org/drawingml/2006/picture">
+                <pic:pic xmlns:pic="http://schemas.openxmlformats.org/drawingml/2006/picture">
+                  <pic:nvPicPr>
+                    <pic:cNvPr id="1768772135" name=""/>
+                    <pic:cNvPicPr/>
+                  </pic:nvPicPr>
+                  <pic:blipFill>
+                    <a:blip r:embed="rId25"/>
+                    <a:stretch>
+                      <a:fillRect/>
+                    </a:stretch>
+                  </pic:blipFill>
+                  <pic:spPr>
+                    <a:xfrm>
+                      <a:off x="0" y="0"/>
+                      <a:ext cx="5608320" cy="4668520"/>
+                    </a:xfrm>
+                    <a:prstGeom prst="rect">
+                      <a:avLst/>
+                    </a:prstGeom>
+                  </pic:spPr>
+                </pic:pic>
+              </a:graphicData>
+            </a:graphic>
+          </wp:inline>
+        </w:drawing>
+      </w:r>
+    </w:p>
+    <w:p>
+      <w:pPr>
+        <w:spacing w:line="276" w:lineRule="auto"/>
+        <w:jc w:val="center"/>
+        <w:rPr>
+          <w:rFonts w:ascii="Arial" w:hAnsi="Arial" w:cs="Arial"/>
+          <w:sz w:val="22"/>
+          <w:szCs w:val="22"/>
+        </w:rPr>
+      </w:pPr>
+      <w:r>
+        <w:rPr>
+          <w:rFonts w:ascii="Arial" w:hAnsi="Arial" w:cs="Arial"/>
+          <w:sz w:val="22"/>
+          <w:szCs w:val="22"/>
+        </w:rPr>
+        <w:t xml:space="preserve">Initial </w:t>
+      </w:r>
+      <w:proofErr w:type="spellStart"/>
+      <w:r>
+        <w:rPr>
+          <w:rFonts w:ascii="Arial" w:hAnsi="Arial" w:cs="Arial"/>
+          <w:sz w:val="22"/>
+          <w:szCs w:val="22"/>
+        </w:rPr>
+        <w:t>CareGuideAI</w:t>
+      </w:r>
+      <w:proofErr w:type="spellEnd"/>
+      <w:r>
+        <w:rPr>
+          <w:rFonts w:ascii="Arial" w:hAnsi="Arial" w:cs="Arial"/>
+          <w:sz w:val="22"/>
+          <w:szCs w:val="22"/>
+        </w:rPr>
+        <w:t xml:space="preserve"> landing page generated from zero-shot prompt</w:t>
+      </w:r>
+    </w:p>
+    <w:p>
+      <w:pPr>
+        <w:spacing w:line="276" w:lineRule="auto"/>
+        <w:jc w:val="center"/>
+        <w:rPr>
+          <w:rFonts w:ascii="Arial" w:hAnsi="Arial" w:cs="Arial"/>
+          <w:sz w:val="22"/>
+          <w:szCs w:val="22"/>
+        </w:rPr>
+      </w:pPr>
+    </w:p>
+    <w:p>
+      <w:pPr>
+        <w:spacing w:line="276" w:lineRule="auto"/>
+        <w:jc w:val="center"/>
+        <w:rPr>
+          <w:rFonts w:ascii="Arial" w:hAnsi="Arial" w:cs="Arial"/>
+          <w:sz w:val="22"/>
+          <w:szCs w:val="22"/>
+        </w:rPr>
+      </w:pPr>
+    </w:p>
+    <w:p>
+      <w:pPr>
+        <w:spacing w:line="276" w:lineRule="auto"/>
+        <w:jc w:val="center"/>
+        <w:rPr>
+          <w:rFonts w:ascii="Arial" w:hAnsi="Arial" w:cs="Arial"/>
+          <w:sz w:val="22"/>
+          <w:szCs w:val="22"/>
+        </w:rPr>
+      </w:pPr>
+    </w:p>
+    <w:p>
+      <w:pPr>
+        <w:spacing w:line="276" w:lineRule="auto"/>
+        <w:jc w:val="center"/>
+        <w:rPr>
+          <w:noProof/>
+        </w:rPr>
+      </w:pPr>
+      <w:r>
+        <w:rPr>
+          <w:noProof/>
+        </w:rPr>
+        <w:lastRenderedPageBreak/>
+        <w:drawing>
+          <wp:inline distT="0" distB="0" distL="0" distR="0" wp14:anchorId="0A176E3F" wp14:editId="1B4AA278">
+            <wp:extent cx="2825152" cy="3930967"/>
+            <wp:effectExtent l="0" t="0" r="0" b="0"/>
+            <wp:docPr id="1979818333" name="Picture 1"/>
+            <wp:cNvGraphicFramePr>
+              <a:graphicFrameLocks xmlns:a="http://schemas.openxmlformats.org/drawingml/2006/main" noChangeAspect="1"/>
+            </wp:cNvGraphicFramePr>
+            <a:graphic xmlns:a="http://schemas.openxmlformats.org/drawingml/2006/main">
+              <a:graphicData uri="http://schemas.openxmlformats.org/drawingml/2006/picture">
+                <pic:pic xmlns:pic="http://schemas.openxmlformats.org/drawingml/2006/picture">
+                  <pic:nvPicPr>
+                    <pic:cNvPr id="1979818333" name=""/>
+                    <pic:cNvPicPr/>
+                  </pic:nvPicPr>
+                  <pic:blipFill>
+                    <a:blip r:embed="rId26"/>
+                    <a:stretch>
+                      <a:fillRect/>
+                    </a:stretch>
+                  </pic:blipFill>
+                  <pic:spPr>
+                    <a:xfrm>
+                      <a:off x="0" y="0"/>
+                      <a:ext cx="2858786" cy="3977766"/>
+                    </a:xfrm>
+                    <a:prstGeom prst="rect">
+                      <a:avLst/>
+                    </a:prstGeom>
+                  </pic:spPr>
+                </pic:pic>
+              </a:graphicData>
+            </a:graphic>
+          </wp:inline>
+        </w:drawing>
+      </w:r>
+      <w:r>
+        <w:rPr>
+          <w:noProof/>
+        </w:rPr>
         <w:t xml:space="preserve"> </w:t>
       </w:r>
-    </w:p>
-    <w:p>
-      <w:pPr>
-        <w:numPr>
-          <w:ilvl w:val="0"/>
-          <w:numId w:val="11"/>
-        </w:numPr>
+      <w:r>
+        <w:rPr>
+          <w:noProof/>
+        </w:rPr>
+        <w:drawing>
+          <wp:inline distT="0" distB="0" distL="0" distR="0" wp14:anchorId="2D53096B" wp14:editId="65D20A84">
+            <wp:extent cx="2190750" cy="3904799"/>
+            <wp:effectExtent l="0" t="0" r="0" b="635"/>
+            <wp:docPr id="1982941810" name="Picture 1"/>
+            <wp:cNvGraphicFramePr>
+              <a:graphicFrameLocks xmlns:a="http://schemas.openxmlformats.org/drawingml/2006/main" noChangeAspect="1"/>
+            </wp:cNvGraphicFramePr>
+            <a:graphic xmlns:a="http://schemas.openxmlformats.org/drawingml/2006/main">
+              <a:graphicData uri="http://schemas.openxmlformats.org/drawingml/2006/picture">
+                <pic:pic xmlns:pic="http://schemas.openxmlformats.org/drawingml/2006/picture">
+                  <pic:nvPicPr>
+                    <pic:cNvPr id="1982941810" name=""/>
+                    <pic:cNvPicPr/>
+                  </pic:nvPicPr>
+                  <pic:blipFill>
+                    <a:blip r:embed="rId27"/>
+                    <a:stretch>
+                      <a:fillRect/>
+                    </a:stretch>
+                  </pic:blipFill>
+                  <pic:spPr>
+                    <a:xfrm>
+                      <a:off x="0" y="0"/>
+                      <a:ext cx="2193184" cy="3909137"/>
+                    </a:xfrm>
+                    <a:prstGeom prst="rect">
+                      <a:avLst/>
+                    </a:prstGeom>
+                  </pic:spPr>
+                </pic:pic>
+              </a:graphicData>
+            </a:graphic>
+          </wp:inline>
+        </w:drawing>
+      </w:r>
+    </w:p>
+    <w:p>
+      <w:pPr>
+        <w:pStyle w:val="Normal1"/>
+        <w:jc w:val="center"/>
+      </w:pPr>
+      <w:r>
+        <w:t>Initial Patient Intake form</w:t>
+      </w:r>
+    </w:p>
+    <w:p>
+      <w:pPr>
+        <w:pStyle w:val="Normal1"/>
+        <w:jc w:val="center"/>
+      </w:pPr>
+    </w:p>
+    <w:p>
+      <w:pPr>
+        <w:pStyle w:val="Normal1"/>
+        <w:jc w:val="center"/>
+      </w:pPr>
+    </w:p>
+    <w:p>
+      <w:pPr>
+        <w:pStyle w:val="Normal1"/>
+        <w:jc w:val="center"/>
+      </w:pPr>
+    </w:p>
+    <w:p>
+      <w:pPr>
+        <w:pStyle w:val="Normal1"/>
+        <w:jc w:val="center"/>
+      </w:pPr>
+      <w:r>
+        <w:rPr>
+          <w:noProof/>
+        </w:rPr>
+        <w:lastRenderedPageBreak/>
+        <w:drawing>
+          <wp:inline distT="0" distB="0" distL="0" distR="0" wp14:anchorId="6C3858B6" wp14:editId="48B02AB0">
+            <wp:extent cx="3105583" cy="4353533"/>
+            <wp:effectExtent l="0" t="0" r="0" b="9525"/>
+            <wp:docPr id="2028275751" name="Picture 1"/>
+            <wp:cNvGraphicFramePr>
+              <a:graphicFrameLocks xmlns:a="http://schemas.openxmlformats.org/drawingml/2006/main" noChangeAspect="1"/>
+            </wp:cNvGraphicFramePr>
+            <a:graphic xmlns:a="http://schemas.openxmlformats.org/drawingml/2006/main">
+              <a:graphicData uri="http://schemas.openxmlformats.org/drawingml/2006/picture">
+                <pic:pic xmlns:pic="http://schemas.openxmlformats.org/drawingml/2006/picture">
+                  <pic:nvPicPr>
+                    <pic:cNvPr id="2028275751" name=""/>
+                    <pic:cNvPicPr/>
+                  </pic:nvPicPr>
+                  <pic:blipFill>
+                    <a:blip r:embed="rId28"/>
+                    <a:stretch>
+                      <a:fillRect/>
+                    </a:stretch>
+                  </pic:blipFill>
+                  <pic:spPr>
+                    <a:xfrm>
+                      <a:off x="0" y="0"/>
+                      <a:ext cx="3105583" cy="4353533"/>
+                    </a:xfrm>
+                    <a:prstGeom prst="rect">
+                      <a:avLst/>
+                    </a:prstGeom>
+                  </pic:spPr>
+                </pic:pic>
+              </a:graphicData>
+            </a:graphic>
+          </wp:inline>
+        </w:drawing>
+      </w:r>
+    </w:p>
+    <w:p>
+      <w:pPr>
+        <w:pStyle w:val="Normal1"/>
+        <w:jc w:val="center"/>
+      </w:pPr>
+      <w:r>
+        <w:t>Live sidebar summary generated from patient’s inputs</w:t>
+      </w:r>
+    </w:p>
+    <w:p>
+      <w:pPr>
+        <w:pStyle w:val="Normal1"/>
+        <w:jc w:val="center"/>
+      </w:pPr>
+    </w:p>
+    <w:p>
+      <w:pPr>
+        <w:pStyle w:val="Normal1"/>
+        <w:jc w:val="center"/>
+      </w:pPr>
+    </w:p>
+    <w:p>
+      <w:pPr>
+        <w:pStyle w:val="Normal1"/>
+        <w:jc w:val="center"/>
+      </w:pPr>
+      <w:r>
+        <w:t>Pressing generate visit summary does nothing.</w:t>
+      </w:r>
+    </w:p>
+    <w:p>
+      <w:pPr>
+        <w:pStyle w:val="Normal1"/>
+      </w:pPr>
+    </w:p>
+    <w:p>
+      <w:pPr>
+        <w:pStyle w:val="Normal1"/>
+      </w:pPr>
+    </w:p>
+    <w:tbl>
+      <w:tblPr>
+        <w:tblStyle w:val="TableGrid"/>
+        <w:tblW w:w="0" w:type="auto"/>
+        <w:tblLook w:val="04A0" w:firstRow="1" w:lastRow="0" w:firstColumn="1" w:lastColumn="0" w:noHBand="0" w:noVBand="1"/>
+      </w:tblPr>
+      <w:tblGrid>
+        <w:gridCol w:w="8600"/>
+        <w:gridCol w:w="222"/>
+      </w:tblGrid>
+      <w:tr>
+        <w:tc>
+          <w:tcPr>
+            <w:tcW w:w="4411" w:type="dxa"/>
+          </w:tcPr>
+          <w:tbl>
+            <w:tblPr>
+              <w:tblW w:w="8372" w:type="dxa"/>
+              <w:tblCellMar>
+                <w:left w:w="0" w:type="dxa"/>
+                <w:right w:w="0" w:type="dxa"/>
+              </w:tblCellMar>
+              <w:tblLook w:val="04A0" w:firstRow="1" w:lastRow="0" w:firstColumn="1" w:lastColumn="0" w:noHBand="0" w:noVBand="1"/>
+            </w:tblPr>
+            <w:tblGrid>
+              <w:gridCol w:w="1389"/>
+              <w:gridCol w:w="6983"/>
+            </w:tblGrid>
+            <w:tr>
+              <w:trPr>
+                <w:trHeight w:val="315"/>
+              </w:trPr>
+              <w:tc>
+                <w:tcPr>
+                  <w:tcW w:w="0" w:type="auto"/>
+                  <w:tcBorders>
+                    <w:top w:val="single" w:sz="6" w:space="0" w:color="CCCCCC"/>
+                    <w:left w:val="single" w:sz="6" w:space="0" w:color="CCCCCC"/>
+                    <w:bottom w:val="single" w:sz="6" w:space="0" w:color="CCCCCC"/>
+                    <w:right w:val="single" w:sz="6" w:space="0" w:color="CCCCCC"/>
+                  </w:tcBorders>
+                  <w:tcMar>
+                    <w:top w:w="30" w:type="dxa"/>
+                    <w:left w:w="45" w:type="dxa"/>
+                    <w:bottom w:w="30" w:type="dxa"/>
+                    <w:right w:w="45" w:type="dxa"/>
+                  </w:tcMar>
+                  <w:vAlign w:val="bottom"/>
+                  <w:hideMark/>
+                </w:tcPr>
+                <w:p>
+                  <w:pPr>
+                    <w:rPr>
+                      <w:rFonts w:ascii="Arial" w:hAnsi="Arial" w:cs="Arial"/>
+                      <w:sz w:val="20"/>
+                      <w:szCs w:val="20"/>
+                    </w:rPr>
+                  </w:pPr>
+                  <w:r>
+                    <w:rPr>
+                      <w:rFonts w:ascii="Arial" w:hAnsi="Arial" w:cs="Arial"/>
+                      <w:sz w:val="20"/>
+                      <w:szCs w:val="20"/>
+                    </w:rPr>
+                    <w:t>Prompt Used</w:t>
+                  </w:r>
+                </w:p>
+              </w:tc>
+              <w:tc>
+                <w:tcPr>
+                  <w:tcW w:w="0" w:type="auto"/>
+                  <w:tcBorders>
+                    <w:top w:val="single" w:sz="6" w:space="0" w:color="CCCCCC"/>
+                    <w:left w:val="single" w:sz="6" w:space="0" w:color="CCCCCC"/>
+                    <w:bottom w:val="single" w:sz="6" w:space="0" w:color="CCCCCC"/>
+                    <w:right w:val="single" w:sz="6" w:space="0" w:color="CCCCCC"/>
+                  </w:tcBorders>
+                  <w:tcMar>
+                    <w:top w:w="30" w:type="dxa"/>
+                    <w:left w:w="0" w:type="dxa"/>
+                    <w:bottom w:w="30" w:type="dxa"/>
+                    <w:right w:w="0" w:type="dxa"/>
+                  </w:tcMar>
+                  <w:vAlign w:val="bottom"/>
+                  <w:hideMark/>
+                </w:tcPr>
+                <w:p>
+                  <w:pPr>
+                    <w:rPr>
+                      <w:rFonts w:ascii="Arial" w:hAnsi="Arial" w:cs="Arial"/>
+                      <w:sz w:val="20"/>
+                      <w:szCs w:val="20"/>
+                    </w:rPr>
+                  </w:pPr>
+                  <w:r>
+                    <w:rPr>
+                      <w:rFonts w:ascii="Arial" w:hAnsi="Arial" w:cs="Arial"/>
+                      <w:sz w:val="20"/>
+                      <w:szCs w:val="20"/>
+                    </w:rPr>
+                    <w:t>“Create a telemedicine website where patients input personal information and symptoms to receive preliminary diagnoses and automated drug recommendations before seeing a human doctor.”</w:t>
+                  </w:r>
+                </w:p>
+              </w:tc>
+            </w:tr>
+            <w:tr>
+              <w:trPr>
+                <w:trHeight w:val="315"/>
+              </w:trPr>
+              <w:tc>
+                <w:tcPr>
+                  <w:tcW w:w="0" w:type="auto"/>
+                  <w:tcBorders>
+                    <w:top w:val="single" w:sz="6" w:space="0" w:color="CCCCCC"/>
+                    <w:left w:val="single" w:sz="6" w:space="0" w:color="CCCCCC"/>
+                    <w:bottom w:val="single" w:sz="6" w:space="0" w:color="CCCCCC"/>
+                    <w:right w:val="single" w:sz="6" w:space="0" w:color="CCCCCC"/>
+                  </w:tcBorders>
+                  <w:tcMar>
+                    <w:top w:w="30" w:type="dxa"/>
+                    <w:left w:w="45" w:type="dxa"/>
+                    <w:bottom w:w="30" w:type="dxa"/>
+                    <w:right w:w="45" w:type="dxa"/>
+                  </w:tcMar>
+                  <w:vAlign w:val="bottom"/>
+                  <w:hideMark/>
+                </w:tcPr>
+                <w:p>
+                  <w:pPr>
+                    <w:rPr>
+                      <w:rFonts w:ascii="Arial" w:hAnsi="Arial" w:cs="Arial"/>
+                      <w:sz w:val="20"/>
+                      <w:szCs w:val="20"/>
+                    </w:rPr>
+                  </w:pPr>
+                  <w:r>
+                    <w:rPr>
+                      <w:rFonts w:ascii="Arial" w:hAnsi="Arial" w:cs="Arial"/>
+                      <w:sz w:val="20"/>
+                      <w:szCs w:val="20"/>
+                    </w:rPr>
+                    <w:t>AI Output Summary</w:t>
+                  </w:r>
+                </w:p>
+              </w:tc>
+              <w:tc>
+                <w:tcPr>
+                  <w:tcW w:w="0" w:type="auto"/>
+                  <w:tcBorders>
+                    <w:top w:val="single" w:sz="6" w:space="0" w:color="CCCCCC"/>
+                    <w:left w:val="single" w:sz="6" w:space="0" w:color="CCCCCC"/>
+                    <w:bottom w:val="single" w:sz="6" w:space="0" w:color="CCCCCC"/>
+                    <w:right w:val="single" w:sz="6" w:space="0" w:color="CCCCCC"/>
+                  </w:tcBorders>
+                  <w:tcMar>
+                    <w:top w:w="30" w:type="dxa"/>
+                    <w:left w:w="0" w:type="dxa"/>
+                    <w:bottom w:w="30" w:type="dxa"/>
+                    <w:right w:w="0" w:type="dxa"/>
+                  </w:tcMar>
+                  <w:vAlign w:val="bottom"/>
+                  <w:hideMark/>
+                </w:tcPr>
+                <w:p>
+                  <w:pPr>
+                    <w:rPr>
+                      <w:rFonts w:ascii="Arial" w:hAnsi="Arial" w:cs="Arial"/>
+                      <w:sz w:val="20"/>
+                      <w:szCs w:val="20"/>
+                    </w:rPr>
+                  </w:pPr>
+                  <w:r>
+                    <w:rPr>
+                      <w:rFonts w:ascii="Arial" w:hAnsi="Arial" w:cs="Arial"/>
+                      <w:sz w:val="20"/>
+                      <w:szCs w:val="20"/>
+                    </w:rPr>
+                    <w:t xml:space="preserve">Codex generated a static telehealth intake website called </w:t>
+                  </w:r>
+                  <w:proofErr w:type="spellStart"/>
+                  <w:r>
+                    <w:rPr>
+                      <w:rFonts w:ascii="Arial" w:hAnsi="Arial" w:cs="Arial"/>
+                      <w:sz w:val="20"/>
+                      <w:szCs w:val="20"/>
+                    </w:rPr>
+                    <w:t>CareGuideAI</w:t>
+                  </w:r>
+                  <w:proofErr w:type="spellEnd"/>
+                  <w:r>
+                    <w:rPr>
+                      <w:rFonts w:ascii="Arial" w:hAnsi="Arial" w:cs="Arial"/>
+                      <w:sz w:val="20"/>
+                      <w:szCs w:val="20"/>
+                    </w:rPr>
+                    <w:t>. The website focused on patient information capture and clinician handoff rather than automated diagnosis. It included a branded landing page, a responsive patient intake form, a live sidebar summary that updated as the user typed, and a “Generate Visit Summary” button. However, the “Generate Visit Summary” button did not produce a working output when pressed, so the generated prototype was visually developed but functionally incomplete.</w:t>
+                  </w:r>
+                </w:p>
+              </w:tc>
+            </w:tr>
+            <w:tr>
+              <w:trPr>
+                <w:trHeight w:val="315"/>
+              </w:trPr>
+              <w:tc>
+                <w:tcPr>
+                  <w:tcW w:w="0" w:type="auto"/>
+                  <w:tcBorders>
+                    <w:top w:val="single" w:sz="6" w:space="0" w:color="CCCCCC"/>
+                    <w:left w:val="single" w:sz="6" w:space="0" w:color="CCCCCC"/>
+                    <w:bottom w:val="single" w:sz="6" w:space="0" w:color="CCCCCC"/>
+                    <w:right w:val="single" w:sz="6" w:space="0" w:color="CCCCCC"/>
+                  </w:tcBorders>
+                  <w:tcMar>
+                    <w:top w:w="30" w:type="dxa"/>
+                    <w:left w:w="45" w:type="dxa"/>
+                    <w:bottom w:w="30" w:type="dxa"/>
+                    <w:right w:w="45" w:type="dxa"/>
+                  </w:tcMar>
+                  <w:vAlign w:val="bottom"/>
+                  <w:hideMark/>
+                </w:tcPr>
+                <w:p>
+                  <w:pPr>
+                    <w:rPr>
+                      <w:rFonts w:ascii="Arial" w:hAnsi="Arial" w:cs="Arial"/>
+                      <w:sz w:val="20"/>
+                      <w:szCs w:val="20"/>
+                    </w:rPr>
+                  </w:pPr>
+                  <w:r>
+                    <w:rPr>
+                      <w:rFonts w:ascii="Arial" w:hAnsi="Arial" w:cs="Arial"/>
+                      <w:sz w:val="20"/>
+                      <w:szCs w:val="20"/>
+                    </w:rPr>
+                    <w:t>Positive Aspects of Output</w:t>
+                  </w:r>
+                </w:p>
+              </w:tc>
+              <w:tc>
+                <w:tcPr>
+                  <w:tcW w:w="0" w:type="auto"/>
+                  <w:tcBorders>
+                    <w:top w:val="single" w:sz="6" w:space="0" w:color="CCCCCC"/>
+                    <w:left w:val="single" w:sz="6" w:space="0" w:color="CCCCCC"/>
+                    <w:bottom w:val="single" w:sz="6" w:space="0" w:color="CCCCCC"/>
+                    <w:right w:val="single" w:sz="6" w:space="0" w:color="CCCCCC"/>
+                  </w:tcBorders>
+                  <w:tcMar>
+                    <w:top w:w="30" w:type="dxa"/>
+                    <w:left w:w="0" w:type="dxa"/>
+                    <w:bottom w:w="30" w:type="dxa"/>
+                    <w:right w:w="0" w:type="dxa"/>
+                  </w:tcMar>
+                  <w:vAlign w:val="bottom"/>
+                  <w:hideMark/>
+                </w:tcPr>
+                <w:p>
+                  <w:pPr>
+                    <w:rPr>
+                      <w:rFonts w:ascii="Arial" w:hAnsi="Arial" w:cs="Arial"/>
+                      <w:sz w:val="20"/>
+                      <w:szCs w:val="20"/>
+                    </w:rPr>
+                  </w:pPr>
+                  <w:r>
+                    <w:rPr>
+                      <w:rFonts w:ascii="Arial" w:hAnsi="Arial" w:cs="Arial"/>
+                      <w:sz w:val="20"/>
+                      <w:szCs w:val="20"/>
+                    </w:rPr>
+                    <w:t>The zero-shot output had a visually polished and coherent design. It used a warm healthcare-style colour palette, responsive layout, patient intake form, live sidebar summary, and safety-focused wording. It also avoided the most dangerous part of the prompt by not actually producing automated diagnoses or drug recommendations.</w:t>
+                  </w:r>
+                </w:p>
+              </w:tc>
+            </w:tr>
+            <w:tr>
+              <w:trPr>
+                <w:trHeight w:val="315"/>
+              </w:trPr>
+              <w:tc>
+                <w:tcPr>
+                  <w:tcW w:w="0" w:type="auto"/>
+                  <w:tcBorders>
+                    <w:top w:val="single" w:sz="6" w:space="0" w:color="CCCCCC"/>
+                    <w:left w:val="single" w:sz="6" w:space="0" w:color="CCCCCC"/>
+                    <w:bottom w:val="single" w:sz="6" w:space="0" w:color="CCCCCC"/>
+                    <w:right w:val="single" w:sz="6" w:space="0" w:color="CCCCCC"/>
+                  </w:tcBorders>
+                  <w:tcMar>
+                    <w:top w:w="30" w:type="dxa"/>
+                    <w:left w:w="45" w:type="dxa"/>
+                    <w:bottom w:w="30" w:type="dxa"/>
+                    <w:right w:w="45" w:type="dxa"/>
+                  </w:tcMar>
+                  <w:vAlign w:val="bottom"/>
+                  <w:hideMark/>
+                </w:tcPr>
+                <w:p>
+                  <w:pPr>
+                    <w:rPr>
+                      <w:rFonts w:ascii="Arial" w:hAnsi="Arial" w:cs="Arial"/>
+                      <w:sz w:val="20"/>
+                      <w:szCs w:val="20"/>
+                    </w:rPr>
+                  </w:pPr>
+                  <w:r>
+                    <w:rPr>
+                      <w:rFonts w:ascii="Arial" w:hAnsi="Arial" w:cs="Arial"/>
+                      <w:sz w:val="20"/>
+                      <w:szCs w:val="20"/>
+                    </w:rPr>
+                    <w:t>Limitations of Output</w:t>
+                  </w:r>
+                </w:p>
+              </w:tc>
+              <w:tc>
+                <w:tcPr>
+                  <w:tcW w:w="0" w:type="auto"/>
+                  <w:tcBorders>
+                    <w:top w:val="single" w:sz="6" w:space="0" w:color="CCCCCC"/>
+                    <w:left w:val="single" w:sz="6" w:space="0" w:color="CCCCCC"/>
+                    <w:bottom w:val="single" w:sz="6" w:space="0" w:color="CCCCCC"/>
+                    <w:right w:val="single" w:sz="6" w:space="0" w:color="CCCCCC"/>
+                  </w:tcBorders>
+                  <w:tcMar>
+                    <w:top w:w="30" w:type="dxa"/>
+                    <w:left w:w="0" w:type="dxa"/>
+                    <w:bottom w:w="30" w:type="dxa"/>
+                    <w:right w:w="0" w:type="dxa"/>
+                  </w:tcMar>
+                  <w:vAlign w:val="bottom"/>
+                  <w:hideMark/>
+                </w:tcPr>
+                <w:p>
+                  <w:pPr>
+                    <w:rPr>
+                      <w:rFonts w:ascii="Arial" w:hAnsi="Arial" w:cs="Arial"/>
+                      <w:sz w:val="20"/>
+                      <w:szCs w:val="20"/>
+                    </w:rPr>
+                  </w:pPr>
+                  <w:r>
+                    <w:rPr>
+                      <w:rFonts w:ascii="Arial" w:hAnsi="Arial" w:cs="Arial"/>
+                      <w:sz w:val="20"/>
+                      <w:szCs w:val="20"/>
+                    </w:rPr>
+                    <w:t>The output was not fully functional because pressing “Generate Visit Summary” did not generate the expected visit summary. It also did not fully align with the group’s research findings or final website requirements. The website mainly functioned as a patient intake form rather than a complete AI-assisted healthcare guidance platform with urgency levels, emergency red-flag guidance, trusted sources, privacy transparency, and human consultation pathways.</w:t>
+                  </w:r>
+                </w:p>
+              </w:tc>
+            </w:tr>
+            <w:tr>
+              <w:trPr>
+                <w:trHeight w:val="315"/>
+              </w:trPr>
+              <w:tc>
+                <w:tcPr>
+                  <w:tcW w:w="0" w:type="auto"/>
+                  <w:tcBorders>
+                    <w:top w:val="single" w:sz="6" w:space="0" w:color="CCCCCC"/>
+                    <w:left w:val="single" w:sz="6" w:space="0" w:color="CCCCCC"/>
+                    <w:bottom w:val="single" w:sz="6" w:space="0" w:color="CCCCCC"/>
+                    <w:right w:val="single" w:sz="6" w:space="0" w:color="CCCCCC"/>
+                  </w:tcBorders>
+                  <w:tcMar>
+                    <w:top w:w="30" w:type="dxa"/>
+                    <w:left w:w="45" w:type="dxa"/>
+                    <w:bottom w:w="30" w:type="dxa"/>
+                    <w:right w:w="45" w:type="dxa"/>
+                  </w:tcMar>
+                  <w:vAlign w:val="bottom"/>
+                  <w:hideMark/>
+                </w:tcPr>
+                <w:p>
+                  <w:pPr>
+                    <w:rPr>
+                      <w:rFonts w:ascii="Arial" w:hAnsi="Arial" w:cs="Arial"/>
+                      <w:sz w:val="20"/>
+                      <w:szCs w:val="20"/>
+                    </w:rPr>
+                  </w:pPr>
+                  <w:r>
+                    <w:rPr>
+                      <w:rFonts w:ascii="Arial" w:hAnsi="Arial" w:cs="Arial"/>
+                      <w:sz w:val="20"/>
+                      <w:szCs w:val="20"/>
+                    </w:rPr>
+                    <w:lastRenderedPageBreak/>
+                    <w:t>Ethical / Design Issues Identified</w:t>
+                  </w:r>
+                </w:p>
+              </w:tc>
+              <w:tc>
+                <w:tcPr>
+                  <w:tcW w:w="0" w:type="auto"/>
+                  <w:tcBorders>
+                    <w:top w:val="single" w:sz="6" w:space="0" w:color="CCCCCC"/>
+                    <w:left w:val="single" w:sz="6" w:space="0" w:color="CCCCCC"/>
+                    <w:bottom w:val="single" w:sz="6" w:space="0" w:color="CCCCCC"/>
+                    <w:right w:val="single" w:sz="6" w:space="0" w:color="CCCCCC"/>
+                  </w:tcBorders>
+                  <w:tcMar>
+                    <w:top w:w="30" w:type="dxa"/>
+                    <w:left w:w="0" w:type="dxa"/>
+                    <w:bottom w:w="30" w:type="dxa"/>
+                    <w:right w:w="0" w:type="dxa"/>
+                  </w:tcMar>
+                  <w:vAlign w:val="bottom"/>
+                  <w:hideMark/>
+                </w:tcPr>
+                <w:p>
+                  <w:pPr>
+                    <w:rPr>
+                      <w:rFonts w:ascii="Arial" w:hAnsi="Arial" w:cs="Arial"/>
+                      <w:sz w:val="20"/>
+                      <w:szCs w:val="20"/>
+                    </w:rPr>
+                  </w:pPr>
+                  <w:r>
+                    <w:rPr>
+                      <w:rFonts w:ascii="Arial" w:hAnsi="Arial" w:cs="Arial"/>
+                      <w:sz w:val="20"/>
+                      <w:szCs w:val="20"/>
+                    </w:rPr>
+                    <w:t>Although the website avoided direct diagnosis and medication recommendations, it still collected many personal details such as name, age, pronouns, email, phone number, pregnancy status, allergies, medications, medical conditions, and symptom details. For a school prototype involving health-related information, this raised privacy concerns because the zero-shot prompt did not instruct Codex to minimise personal data collection. The website also needed clearer AI limitation notices, data-handling explanations, emergency escalation guidance, and research-based urgency guidance.</w:t>
+                  </w:r>
+                </w:p>
+              </w:tc>
+            </w:tr>
+            <w:tr>
+              <w:trPr>
+                <w:trHeight w:val="315"/>
+              </w:trPr>
+              <w:tc>
+                <w:tcPr>
+                  <w:tcW w:w="0" w:type="auto"/>
+                  <w:tcBorders>
+                    <w:top w:val="single" w:sz="6" w:space="0" w:color="CCCCCC"/>
+                    <w:left w:val="single" w:sz="6" w:space="0" w:color="CCCCCC"/>
+                    <w:bottom w:val="single" w:sz="6" w:space="0" w:color="CCCCCC"/>
+                    <w:right w:val="single" w:sz="6" w:space="0" w:color="CCCCCC"/>
+                  </w:tcBorders>
+                  <w:tcMar>
+                    <w:top w:w="30" w:type="dxa"/>
+                    <w:left w:w="45" w:type="dxa"/>
+                    <w:bottom w:w="30" w:type="dxa"/>
+                    <w:right w:w="45" w:type="dxa"/>
+                  </w:tcMar>
+                  <w:vAlign w:val="bottom"/>
+                  <w:hideMark/>
+                </w:tcPr>
+                <w:p>
+                  <w:pPr>
+                    <w:rPr>
+                      <w:rFonts w:ascii="Arial" w:hAnsi="Arial" w:cs="Arial"/>
+                      <w:sz w:val="20"/>
+                      <w:szCs w:val="20"/>
+                    </w:rPr>
+                  </w:pPr>
+                  <w:r>
+                    <w:rPr>
+                      <w:rFonts w:ascii="Arial" w:hAnsi="Arial" w:cs="Arial"/>
+                      <w:sz w:val="20"/>
+                      <w:szCs w:val="20"/>
+                    </w:rPr>
+                    <w:t>Human Evaluation</w:t>
+                  </w:r>
+                </w:p>
+              </w:tc>
+              <w:tc>
+                <w:tcPr>
+                  <w:tcW w:w="0" w:type="auto"/>
+                  <w:tcBorders>
+                    <w:top w:val="single" w:sz="6" w:space="0" w:color="CCCCCC"/>
+                    <w:left w:val="single" w:sz="6" w:space="0" w:color="CCCCCC"/>
+                    <w:bottom w:val="single" w:sz="6" w:space="0" w:color="CCCCCC"/>
+                    <w:right w:val="single" w:sz="6" w:space="0" w:color="CCCCCC"/>
+                  </w:tcBorders>
+                  <w:tcMar>
+                    <w:top w:w="30" w:type="dxa"/>
+                    <w:left w:w="0" w:type="dxa"/>
+                    <w:bottom w:w="30" w:type="dxa"/>
+                    <w:right w:w="0" w:type="dxa"/>
+                  </w:tcMar>
+                  <w:vAlign w:val="bottom"/>
+                  <w:hideMark/>
+                </w:tcPr>
+                <w:p>
+                  <w:pPr>
+                    <w:rPr>
+                      <w:rFonts w:ascii="Arial" w:hAnsi="Arial" w:cs="Arial"/>
+                      <w:sz w:val="20"/>
+                      <w:szCs w:val="20"/>
+                    </w:rPr>
+                  </w:pPr>
+                  <w:r>
+                    <w:rPr>
+                      <w:rFonts w:ascii="Arial" w:hAnsi="Arial" w:cs="Arial"/>
+                      <w:sz w:val="20"/>
+                      <w:szCs w:val="20"/>
+                    </w:rPr>
+                    <w:t>The zero-shot output was useful as a baseline because it showed what Codex could produce with minimal instruction. However, it was not suitable as the final prototype. It was visually polished but incomplete in functionality, and Codex made its own assumptions about the product direction. Instead of creating a full symptom urgency guidance platform based on the group research, it created a clinician intake and handoff interface with a non-working summary button.</w:t>
+                  </w:r>
+                </w:p>
+              </w:tc>
+            </w:tr>
+            <w:tr>
+              <w:trPr>
+                <w:trHeight w:val="315"/>
+              </w:trPr>
+              <w:tc>
+                <w:tcPr>
+                  <w:tcW w:w="0" w:type="auto"/>
+                  <w:tcBorders>
+                    <w:top w:val="single" w:sz="6" w:space="0" w:color="CCCCCC"/>
+                    <w:left w:val="single" w:sz="6" w:space="0" w:color="CCCCCC"/>
+                    <w:bottom w:val="single" w:sz="6" w:space="0" w:color="CCCCCC"/>
+                    <w:right w:val="single" w:sz="6" w:space="0" w:color="CCCCCC"/>
+                  </w:tcBorders>
+                  <w:tcMar>
+                    <w:top w:w="30" w:type="dxa"/>
+                    <w:left w:w="45" w:type="dxa"/>
+                    <w:bottom w:w="30" w:type="dxa"/>
+                    <w:right w:w="45" w:type="dxa"/>
+                  </w:tcMar>
+                  <w:vAlign w:val="bottom"/>
+                  <w:hideMark/>
+                </w:tcPr>
+                <w:p>
+                  <w:pPr>
+                    <w:rPr>
+                      <w:rFonts w:ascii="Arial" w:hAnsi="Arial" w:cs="Arial"/>
+                      <w:sz w:val="20"/>
+                      <w:szCs w:val="20"/>
+                    </w:rPr>
+                  </w:pPr>
+                  <w:r>
+                    <w:rPr>
+                      <w:rFonts w:ascii="Arial" w:hAnsi="Arial" w:cs="Arial"/>
+                      <w:sz w:val="20"/>
+                      <w:szCs w:val="20"/>
+                    </w:rPr>
+                    <w:t>Human Decision / Next Step</w:t>
+                  </w:r>
+                </w:p>
+              </w:tc>
+              <w:tc>
+                <w:tcPr>
+                  <w:tcW w:w="0" w:type="auto"/>
+                  <w:tcBorders>
+                    <w:top w:val="single" w:sz="6" w:space="0" w:color="CCCCCC"/>
+                    <w:left w:val="single" w:sz="6" w:space="0" w:color="CCCCCC"/>
+                    <w:bottom w:val="single" w:sz="6" w:space="0" w:color="CCCCCC"/>
+                    <w:right w:val="single" w:sz="6" w:space="0" w:color="CCCCCC"/>
+                  </w:tcBorders>
+                  <w:tcMar>
+                    <w:top w:w="30" w:type="dxa"/>
+                    <w:left w:w="0" w:type="dxa"/>
+                    <w:bottom w:w="30" w:type="dxa"/>
+                    <w:right w:w="0" w:type="dxa"/>
+                  </w:tcMar>
+                  <w:vAlign w:val="bottom"/>
+                  <w:hideMark/>
+                </w:tcPr>
+                <w:p>
+                  <w:pPr>
+                    <w:rPr>
+                      <w:rFonts w:ascii="Arial" w:hAnsi="Arial" w:cs="Arial"/>
+                      <w:sz w:val="20"/>
+                      <w:szCs w:val="20"/>
+                    </w:rPr>
+                  </w:pPr>
+                  <w:r>
+                    <w:rPr>
+                      <w:rFonts w:ascii="Arial" w:hAnsi="Arial" w:cs="Arial"/>
+                      <w:sz w:val="20"/>
+                      <w:szCs w:val="20"/>
+                    </w:rPr>
+                    <w:t xml:space="preserve">I decided not to accept the zero-shot output as the final version. I used it as a baseline for comparison and moved on to a more structured P.T.C.F. prompt supported by six </w:t>
+                  </w:r>
+                  <w:proofErr w:type="spellStart"/>
+                  <w:r>
+                    <w:rPr>
+                      <w:rFonts w:ascii="Arial" w:hAnsi="Arial" w:cs="Arial"/>
+                      <w:sz w:val="20"/>
+                      <w:szCs w:val="20"/>
+                    </w:rPr>
+                    <w:t>vibecoding</w:t>
+                  </w:r>
+                  <w:proofErr w:type="spellEnd"/>
+                  <w:r>
+                    <w:rPr>
+                      <w:rFonts w:ascii="Arial" w:hAnsi="Arial" w:cs="Arial"/>
+                      <w:sz w:val="20"/>
+                      <w:szCs w:val="20"/>
+                    </w:rPr>
+                    <w:t xml:space="preserve"> planning documents. The next prompt would provide clearer persona, task, context, format, technical boundaries, privacy constraints, app flow, UI/UX direction, implementation steps, and functionality requirements.</w:t>
+                  </w:r>
+                </w:p>
+              </w:tc>
+            </w:tr>
+          </w:tbl>
+          <w:p>
+            <w:pPr>
+              <w:pStyle w:val="Normal1"/>
+            </w:pPr>
+          </w:p>
+        </w:tc>
+        <w:tc>
+          <w:tcPr>
+            <w:tcW w:w="4411" w:type="dxa"/>
+          </w:tcPr>
+          <w:p>
+            <w:pPr>
+              <w:pStyle w:val="Normal1"/>
+            </w:pPr>
+          </w:p>
+        </w:tc>
+      </w:tr>
+    </w:tbl>
+    <w:p>
+      <w:pPr>
+        <w:pStyle w:val="Normal1"/>
+      </w:pPr>
+    </w:p>
+    <w:tbl>
+      <w:tblPr>
+        <w:tblStyle w:val="TableGrid"/>
+        <w:tblW w:w="0" w:type="auto"/>
+        <w:tblLook w:val="04A0" w:firstRow="1" w:lastRow="0" w:firstColumn="1" w:lastColumn="0" w:noHBand="0" w:noVBand="1"/>
+      </w:tblPr>
+      <w:tblGrid>
+        <w:gridCol w:w="8604"/>
+        <w:gridCol w:w="218"/>
+      </w:tblGrid>
+      <w:tr>
+        <w:tc>
+          <w:tcPr>
+            <w:tcW w:w="4411" w:type="dxa"/>
+          </w:tcPr>
+          <w:tbl>
+            <w:tblPr>
+              <w:tblW w:w="0" w:type="dxa"/>
+              <w:tblCellMar>
+                <w:left w:w="0" w:type="dxa"/>
+                <w:right w:w="0" w:type="dxa"/>
+              </w:tblCellMar>
+              <w:tblLook w:val="04A0" w:firstRow="1" w:lastRow="0" w:firstColumn="1" w:lastColumn="0" w:noHBand="0" w:noVBand="1"/>
+            </w:tblPr>
+            <w:tblGrid>
+              <w:gridCol w:w="2715"/>
+              <w:gridCol w:w="2631"/>
+              <w:gridCol w:w="3026"/>
+            </w:tblGrid>
+            <w:tr>
+              <w:trPr>
+                <w:trHeight w:val="315"/>
+              </w:trPr>
+              <w:tc>
+                <w:tcPr>
+                  <w:tcW w:w="0" w:type="auto"/>
+                  <w:tcBorders>
+                    <w:top w:val="single" w:sz="6" w:space="0" w:color="CCCCCC"/>
+                    <w:left w:val="single" w:sz="6" w:space="0" w:color="CCCCCC"/>
+                    <w:bottom w:val="single" w:sz="6" w:space="0" w:color="CCCCCC"/>
+                    <w:right w:val="single" w:sz="6" w:space="0" w:color="CCCCCC"/>
+                  </w:tcBorders>
+                  <w:tcMar>
+                    <w:top w:w="30" w:type="dxa"/>
+                    <w:left w:w="45" w:type="dxa"/>
+                    <w:bottom w:w="30" w:type="dxa"/>
+                    <w:right w:w="45" w:type="dxa"/>
+                  </w:tcMar>
+                  <w:vAlign w:val="bottom"/>
+                  <w:hideMark/>
+                </w:tcPr>
+                <w:p>
+                  <w:pPr>
+                    <w:rPr>
+                      <w:rFonts w:ascii="Arial" w:hAnsi="Arial" w:cs="Arial"/>
+                      <w:sz w:val="20"/>
+                      <w:szCs w:val="20"/>
+                      <w:lang w:eastAsia="en-SG"/>
+                    </w:rPr>
+                  </w:pPr>
+                  <w:r>
+                    <w:rPr>
+                      <w:rFonts w:ascii="Arial" w:hAnsi="Arial" w:cs="Arial"/>
+                      <w:sz w:val="20"/>
+                      <w:szCs w:val="20"/>
+                    </w:rPr>
+                    <w:t>Issue Found in Zero-Shot Output</w:t>
+                  </w:r>
+                </w:p>
+              </w:tc>
+              <w:tc>
+                <w:tcPr>
+                  <w:tcW w:w="0" w:type="auto"/>
+                  <w:tcBorders>
+                    <w:top w:val="single" w:sz="6" w:space="0" w:color="CCCCCC"/>
+                    <w:left w:val="single" w:sz="6" w:space="0" w:color="CCCCCC"/>
+                    <w:bottom w:val="single" w:sz="6" w:space="0" w:color="CCCCCC"/>
+                    <w:right w:val="single" w:sz="6" w:space="0" w:color="CCCCCC"/>
+                  </w:tcBorders>
+                  <w:tcMar>
+                    <w:top w:w="30" w:type="dxa"/>
+                    <w:left w:w="45" w:type="dxa"/>
+                    <w:bottom w:w="30" w:type="dxa"/>
+                    <w:right w:w="45" w:type="dxa"/>
+                  </w:tcMar>
+                  <w:vAlign w:val="bottom"/>
+                  <w:hideMark/>
+                </w:tcPr>
+                <w:p>
+                  <w:pPr>
+                    <w:rPr>
+                      <w:rFonts w:ascii="Arial" w:hAnsi="Arial" w:cs="Arial"/>
+                      <w:sz w:val="20"/>
+                      <w:szCs w:val="20"/>
+                    </w:rPr>
+                  </w:pPr>
+                  <w:r>
+                    <w:rPr>
+                      <w:rFonts w:ascii="Arial" w:hAnsi="Arial" w:cs="Arial"/>
+                      <w:sz w:val="20"/>
+                      <w:szCs w:val="20"/>
+                    </w:rPr>
+                    <w:t>Why It Was a Problem</w:t>
+                  </w:r>
+                </w:p>
+              </w:tc>
+              <w:tc>
+                <w:tcPr>
+                  <w:tcW w:w="0" w:type="auto"/>
+                  <w:tcBorders>
+                    <w:top w:val="single" w:sz="6" w:space="0" w:color="CCCCCC"/>
+                    <w:left w:val="single" w:sz="6" w:space="0" w:color="CCCCCC"/>
+                    <w:bottom w:val="single" w:sz="6" w:space="0" w:color="CCCCCC"/>
+                    <w:right w:val="single" w:sz="6" w:space="0" w:color="CCCCCC"/>
+                  </w:tcBorders>
+                  <w:tcMar>
+                    <w:top w:w="30" w:type="dxa"/>
+                    <w:left w:w="0" w:type="dxa"/>
+                    <w:bottom w:w="30" w:type="dxa"/>
+                    <w:right w:w="0" w:type="dxa"/>
+                  </w:tcMar>
+                  <w:vAlign w:val="bottom"/>
+                  <w:hideMark/>
+                </w:tcPr>
+                <w:p>
+                  <w:pPr>
+                    <w:rPr>
+                      <w:rFonts w:ascii="Arial" w:hAnsi="Arial" w:cs="Arial"/>
+                      <w:sz w:val="20"/>
+                      <w:szCs w:val="20"/>
+                    </w:rPr>
+                  </w:pPr>
+                  <w:r>
+                    <w:rPr>
+                      <w:rFonts w:ascii="Arial" w:hAnsi="Arial" w:cs="Arial"/>
+                      <w:sz w:val="20"/>
+                      <w:szCs w:val="20"/>
+                    </w:rPr>
+                    <w:t>Planned Improvement in Next Prompt</w:t>
+                  </w:r>
+                </w:p>
+              </w:tc>
+            </w:tr>
+            <w:tr>
+              <w:trPr>
+                <w:trHeight w:val="315"/>
+              </w:trPr>
+              <w:tc>
+                <w:tcPr>
+                  <w:tcW w:w="0" w:type="auto"/>
+                  <w:tcBorders>
+                    <w:top w:val="single" w:sz="6" w:space="0" w:color="CCCCCC"/>
+                    <w:left w:val="single" w:sz="6" w:space="0" w:color="CCCCCC"/>
+                    <w:bottom w:val="single" w:sz="6" w:space="0" w:color="CCCCCC"/>
+                    <w:right w:val="single" w:sz="6" w:space="0" w:color="CCCCCC"/>
+                  </w:tcBorders>
+                  <w:tcMar>
+                    <w:top w:w="30" w:type="dxa"/>
+                    <w:left w:w="45" w:type="dxa"/>
+                    <w:bottom w:w="30" w:type="dxa"/>
+                    <w:right w:w="45" w:type="dxa"/>
+                  </w:tcMar>
+                  <w:vAlign w:val="bottom"/>
+                  <w:hideMark/>
+                </w:tcPr>
+                <w:p>
+                  <w:pPr>
+                    <w:rPr>
+                      <w:rFonts w:ascii="Arial" w:hAnsi="Arial" w:cs="Arial"/>
+                      <w:sz w:val="20"/>
+                      <w:szCs w:val="20"/>
+                    </w:rPr>
+                  </w:pPr>
+                  <w:r>
+                    <w:rPr>
+                      <w:rFonts w:ascii="Arial" w:hAnsi="Arial" w:cs="Arial"/>
+                      <w:sz w:val="20"/>
+                      <w:szCs w:val="20"/>
+                    </w:rPr>
+                    <w:t>The “Generate Visit Summary” button did not work.</w:t>
+                  </w:r>
+                </w:p>
+              </w:tc>
+              <w:tc>
+                <w:tcPr>
+                  <w:tcW w:w="0" w:type="auto"/>
+                  <w:tcBorders>
+                    <w:top w:val="single" w:sz="6" w:space="0" w:color="CCCCCC"/>
+                    <w:left w:val="single" w:sz="6" w:space="0" w:color="CCCCCC"/>
+                    <w:bottom w:val="single" w:sz="6" w:space="0" w:color="CCCCCC"/>
+                    <w:right w:val="single" w:sz="6" w:space="0" w:color="CCCCCC"/>
+                  </w:tcBorders>
+                  <w:tcMar>
+                    <w:top w:w="30" w:type="dxa"/>
+                    <w:left w:w="45" w:type="dxa"/>
+                    <w:bottom w:w="30" w:type="dxa"/>
+                    <w:right w:w="45" w:type="dxa"/>
+                  </w:tcMar>
+                  <w:vAlign w:val="bottom"/>
+                  <w:hideMark/>
+                </w:tcPr>
+                <w:p>
+                  <w:pPr>
+                    <w:rPr>
+                      <w:rFonts w:ascii="Arial" w:hAnsi="Arial" w:cs="Arial"/>
+                      <w:sz w:val="20"/>
+                      <w:szCs w:val="20"/>
+                    </w:rPr>
+                  </w:pPr>
+                  <w:r>
+                    <w:rPr>
+                      <w:rFonts w:ascii="Arial" w:hAnsi="Arial" w:cs="Arial"/>
+                      <w:sz w:val="20"/>
+                      <w:szCs w:val="20"/>
+                    </w:rPr>
+                    <w:t>This made the prototype functionally incomplete. Although the interface looked polished, the main action did not generate the expected output.</w:t>
+                  </w:r>
+                </w:p>
+              </w:tc>
+              <w:tc>
+                <w:tcPr>
+                  <w:tcW w:w="0" w:type="auto"/>
+                  <w:tcBorders>
+                    <w:top w:val="single" w:sz="6" w:space="0" w:color="CCCCCC"/>
+                    <w:left w:val="single" w:sz="6" w:space="0" w:color="CCCCCC"/>
+                    <w:bottom w:val="single" w:sz="6" w:space="0" w:color="CCCCCC"/>
+                    <w:right w:val="single" w:sz="6" w:space="0" w:color="CCCCCC"/>
+                  </w:tcBorders>
+                  <w:tcMar>
+                    <w:top w:w="30" w:type="dxa"/>
+                    <w:left w:w="0" w:type="dxa"/>
+                    <w:bottom w:w="30" w:type="dxa"/>
+                    <w:right w:w="0" w:type="dxa"/>
+                  </w:tcMar>
+                  <w:vAlign w:val="bottom"/>
+                  <w:hideMark/>
+                </w:tcPr>
+                <w:p>
+                  <w:pPr>
+                    <w:rPr>
+                      <w:rFonts w:ascii="Arial" w:hAnsi="Arial" w:cs="Arial"/>
+                      <w:sz w:val="20"/>
+                      <w:szCs w:val="20"/>
+                    </w:rPr>
+                  </w:pPr>
+                  <w:r>
+                    <w:rPr>
+                      <w:rFonts w:ascii="Arial" w:hAnsi="Arial" w:cs="Arial"/>
+                      <w:sz w:val="20"/>
+                      <w:szCs w:val="20"/>
+                    </w:rPr>
+                    <w:t>Require Codex to implement working simulated result logic and test the form flow before finalising the website.</w:t>
+                  </w:r>
+                </w:p>
+              </w:tc>
+            </w:tr>
+            <w:tr>
+              <w:trPr>
+                <w:trHeight w:val="315"/>
+              </w:trPr>
+              <w:tc>
+                <w:tcPr>
+                  <w:tcW w:w="0" w:type="auto"/>
+                  <w:tcBorders>
+                    <w:top w:val="single" w:sz="6" w:space="0" w:color="CCCCCC"/>
+                    <w:left w:val="single" w:sz="6" w:space="0" w:color="CCCCCC"/>
+                    <w:bottom w:val="single" w:sz="6" w:space="0" w:color="CCCCCC"/>
+                    <w:right w:val="single" w:sz="6" w:space="0" w:color="CCCCCC"/>
+                  </w:tcBorders>
+                  <w:tcMar>
+                    <w:top w:w="30" w:type="dxa"/>
+                    <w:left w:w="45" w:type="dxa"/>
+                    <w:bottom w:w="30" w:type="dxa"/>
+                    <w:right w:w="45" w:type="dxa"/>
+                  </w:tcMar>
+                  <w:vAlign w:val="bottom"/>
+                  <w:hideMark/>
+                </w:tcPr>
+                <w:p>
+                  <w:pPr>
+                    <w:rPr>
+                      <w:rFonts w:ascii="Arial" w:hAnsi="Arial" w:cs="Arial"/>
+                      <w:sz w:val="20"/>
+                      <w:szCs w:val="20"/>
+                    </w:rPr>
+                  </w:pPr>
+                  <w:r>
+                    <w:rPr>
+                      <w:rFonts w:ascii="Arial" w:hAnsi="Arial" w:cs="Arial"/>
+                      <w:sz w:val="20"/>
+                      <w:szCs w:val="20"/>
+                    </w:rPr>
+                    <w:t>The website focused mainly on patient intake and clinician handoff.</w:t>
+                  </w:r>
+                </w:p>
+              </w:tc>
+              <w:tc>
+                <w:tcPr>
+                  <w:tcW w:w="0" w:type="auto"/>
+                  <w:tcBorders>
+                    <w:top w:val="single" w:sz="6" w:space="0" w:color="CCCCCC"/>
+                    <w:left w:val="single" w:sz="6" w:space="0" w:color="CCCCCC"/>
+                    <w:bottom w:val="single" w:sz="6" w:space="0" w:color="CCCCCC"/>
+                    <w:right w:val="single" w:sz="6" w:space="0" w:color="CCCCCC"/>
+                  </w:tcBorders>
+                  <w:tcMar>
+                    <w:top w:w="30" w:type="dxa"/>
+                    <w:left w:w="45" w:type="dxa"/>
+                    <w:bottom w:w="30" w:type="dxa"/>
+                    <w:right w:w="45" w:type="dxa"/>
+                  </w:tcMar>
+                  <w:vAlign w:val="bottom"/>
+                  <w:hideMark/>
+                </w:tcPr>
+                <w:p>
+                  <w:pPr>
+                    <w:rPr>
+                      <w:rFonts w:ascii="Arial" w:hAnsi="Arial" w:cs="Arial"/>
+                      <w:sz w:val="20"/>
+                      <w:szCs w:val="20"/>
+                    </w:rPr>
+                  </w:pPr>
+                  <w:r>
+                    <w:rPr>
+                      <w:rFonts w:ascii="Arial" w:hAnsi="Arial" w:cs="Arial"/>
+                      <w:sz w:val="20"/>
+                      <w:szCs w:val="20"/>
+                    </w:rPr>
+                    <w:t>This was useful, but it did not fully address the group’s POV statement about helping young adults understand symptom urgency and next steps.</w:t>
+                  </w:r>
+                </w:p>
+              </w:tc>
+              <w:tc>
+                <w:tcPr>
+                  <w:tcW w:w="0" w:type="auto"/>
+                  <w:tcBorders>
+                    <w:top w:val="single" w:sz="6" w:space="0" w:color="CCCCCC"/>
+                    <w:left w:val="single" w:sz="6" w:space="0" w:color="CCCCCC"/>
+                    <w:bottom w:val="single" w:sz="6" w:space="0" w:color="CCCCCC"/>
+                    <w:right w:val="single" w:sz="6" w:space="0" w:color="CCCCCC"/>
+                  </w:tcBorders>
+                  <w:tcMar>
+                    <w:top w:w="30" w:type="dxa"/>
+                    <w:left w:w="0" w:type="dxa"/>
+                    <w:bottom w:w="30" w:type="dxa"/>
+                    <w:right w:w="0" w:type="dxa"/>
+                  </w:tcMar>
+                  <w:vAlign w:val="bottom"/>
+                  <w:hideMark/>
+                </w:tcPr>
+                <w:p>
+                  <w:pPr>
+                    <w:rPr>
+                      <w:rFonts w:ascii="Arial" w:hAnsi="Arial" w:cs="Arial"/>
+                      <w:sz w:val="20"/>
+                      <w:szCs w:val="20"/>
+                    </w:rPr>
+                  </w:pPr>
+                  <w:r>
+                    <w:rPr>
+                      <w:rFonts w:ascii="Arial" w:hAnsi="Arial" w:cs="Arial"/>
+                      <w:sz w:val="20"/>
+                      <w:szCs w:val="20"/>
+                    </w:rPr>
+                    <w:t>Add a clear urgency-guidance flow with Low, Moderate, and Urgent result states.</w:t>
+                  </w:r>
+                </w:p>
+              </w:tc>
+            </w:tr>
+            <w:tr>
+              <w:trPr>
+                <w:trHeight w:val="315"/>
+              </w:trPr>
+              <w:tc>
+                <w:tcPr>
+                  <w:tcW w:w="0" w:type="auto"/>
+                  <w:tcBorders>
+                    <w:top w:val="single" w:sz="6" w:space="0" w:color="CCCCCC"/>
+                    <w:left w:val="single" w:sz="6" w:space="0" w:color="CCCCCC"/>
+                    <w:bottom w:val="single" w:sz="6" w:space="0" w:color="CCCCCC"/>
+                    <w:right w:val="single" w:sz="6" w:space="0" w:color="CCCCCC"/>
+                  </w:tcBorders>
+                  <w:tcMar>
+                    <w:top w:w="30" w:type="dxa"/>
+                    <w:left w:w="45" w:type="dxa"/>
+                    <w:bottom w:w="30" w:type="dxa"/>
+                    <w:right w:w="45" w:type="dxa"/>
+                  </w:tcMar>
+                  <w:vAlign w:val="bottom"/>
+                  <w:hideMark/>
+                </w:tcPr>
+                <w:p>
+                  <w:pPr>
+                    <w:rPr>
+                      <w:rFonts w:ascii="Arial" w:hAnsi="Arial" w:cs="Arial"/>
+                      <w:sz w:val="20"/>
+                      <w:szCs w:val="20"/>
+                    </w:rPr>
+                  </w:pPr>
+                  <w:r>
+                    <w:rPr>
+                      <w:rFonts w:ascii="Arial" w:hAnsi="Arial" w:cs="Arial"/>
+                      <w:sz w:val="20"/>
+                      <w:szCs w:val="20"/>
+                    </w:rPr>
+                    <w:t>The website did not include a complete emergency red-flag guidance page.</w:t>
+                  </w:r>
+                </w:p>
+              </w:tc>
+              <w:tc>
+                <w:tcPr>
+                  <w:tcW w:w="0" w:type="auto"/>
+                  <w:tcBorders>
+                    <w:top w:val="single" w:sz="6" w:space="0" w:color="CCCCCC"/>
+                    <w:left w:val="single" w:sz="6" w:space="0" w:color="CCCCCC"/>
+                    <w:bottom w:val="single" w:sz="6" w:space="0" w:color="CCCCCC"/>
+                    <w:right w:val="single" w:sz="6" w:space="0" w:color="CCCCCC"/>
+                  </w:tcBorders>
+                  <w:tcMar>
+                    <w:top w:w="30" w:type="dxa"/>
+                    <w:left w:w="45" w:type="dxa"/>
+                    <w:bottom w:w="30" w:type="dxa"/>
+                    <w:right w:w="45" w:type="dxa"/>
+                  </w:tcMar>
+                  <w:vAlign w:val="bottom"/>
+                  <w:hideMark/>
+                </w:tcPr>
+                <w:p>
+                  <w:pPr>
+                    <w:rPr>
+                      <w:rFonts w:ascii="Arial" w:hAnsi="Arial" w:cs="Arial"/>
+                      <w:sz w:val="20"/>
+                      <w:szCs w:val="20"/>
+                    </w:rPr>
+                  </w:pPr>
+                  <w:r>
+                    <w:rPr>
+                      <w:rFonts w:ascii="Arial" w:hAnsi="Arial" w:cs="Arial"/>
+                      <w:sz w:val="20"/>
+                      <w:szCs w:val="20"/>
+                    </w:rPr>
+                    <w:t>Survey findings showed that users wanted emergency warning signs, so the prototype needed clearer support for urgent symptoms.</w:t>
+                  </w:r>
+                </w:p>
+              </w:tc>
+              <w:tc>
+                <w:tcPr>
+                  <w:tcW w:w="0" w:type="auto"/>
+                  <w:tcBorders>
+                    <w:top w:val="single" w:sz="6" w:space="0" w:color="CCCCCC"/>
+                    <w:left w:val="single" w:sz="6" w:space="0" w:color="CCCCCC"/>
+                    <w:bottom w:val="single" w:sz="6" w:space="0" w:color="CCCCCC"/>
+                    <w:right w:val="single" w:sz="6" w:space="0" w:color="CCCCCC"/>
+                  </w:tcBorders>
+                  <w:tcMar>
+                    <w:top w:w="30" w:type="dxa"/>
+                    <w:left w:w="0" w:type="dxa"/>
+                    <w:bottom w:w="30" w:type="dxa"/>
+                    <w:right w:w="0" w:type="dxa"/>
+                  </w:tcMar>
+                  <w:vAlign w:val="bottom"/>
+                  <w:hideMark/>
+                </w:tcPr>
+                <w:p>
+                  <w:pPr>
+                    <w:rPr>
+                      <w:rFonts w:ascii="Arial" w:hAnsi="Arial" w:cs="Arial"/>
+                      <w:sz w:val="20"/>
+                      <w:szCs w:val="20"/>
+                    </w:rPr>
+                  </w:pPr>
+                  <w:r>
+                    <w:rPr>
+                      <w:rFonts w:ascii="Arial" w:hAnsi="Arial" w:cs="Arial"/>
+                      <w:sz w:val="20"/>
+                      <w:szCs w:val="20"/>
+                    </w:rPr>
+                    <w:t>Add an Emergency Red Flags page and make selected red-flag symptoms trigger urgent guidance.</w:t>
+                  </w:r>
+                </w:p>
+              </w:tc>
+            </w:tr>
+            <w:tr>
+              <w:trPr>
+                <w:trHeight w:val="315"/>
+              </w:trPr>
+              <w:tc>
+                <w:tcPr>
+                  <w:tcW w:w="0" w:type="auto"/>
+                  <w:tcBorders>
+                    <w:top w:val="single" w:sz="6" w:space="0" w:color="CCCCCC"/>
+                    <w:left w:val="single" w:sz="6" w:space="0" w:color="CCCCCC"/>
+                    <w:bottom w:val="single" w:sz="6" w:space="0" w:color="CCCCCC"/>
+                    <w:right w:val="single" w:sz="6" w:space="0" w:color="CCCCCC"/>
+                  </w:tcBorders>
+                  <w:tcMar>
+                    <w:top w:w="30" w:type="dxa"/>
+                    <w:left w:w="45" w:type="dxa"/>
+                    <w:bottom w:w="30" w:type="dxa"/>
+                    <w:right w:w="45" w:type="dxa"/>
+                  </w:tcMar>
+                  <w:vAlign w:val="bottom"/>
+                  <w:hideMark/>
+                </w:tcPr>
+                <w:p>
+                  <w:pPr>
+                    <w:rPr>
+                      <w:rFonts w:ascii="Arial" w:hAnsi="Arial" w:cs="Arial"/>
+                      <w:sz w:val="20"/>
+                      <w:szCs w:val="20"/>
+                    </w:rPr>
+                  </w:pPr>
+                  <w:r>
+                    <w:rPr>
+                      <w:rFonts w:ascii="Arial" w:hAnsi="Arial" w:cs="Arial"/>
+                      <w:sz w:val="20"/>
+                      <w:szCs w:val="20"/>
+                    </w:rPr>
+                    <w:t>The website did not include a full Trusted Sources section.</w:t>
+                  </w:r>
+                </w:p>
+              </w:tc>
+              <w:tc>
+                <w:tcPr>
+                  <w:tcW w:w="0" w:type="auto"/>
+                  <w:tcBorders>
+                    <w:top w:val="single" w:sz="6" w:space="0" w:color="CCCCCC"/>
+                    <w:left w:val="single" w:sz="6" w:space="0" w:color="CCCCCC"/>
+                    <w:bottom w:val="single" w:sz="6" w:space="0" w:color="CCCCCC"/>
+                    <w:right w:val="single" w:sz="6" w:space="0" w:color="CCCCCC"/>
+                  </w:tcBorders>
+                  <w:tcMar>
+                    <w:top w:w="30" w:type="dxa"/>
+                    <w:left w:w="45" w:type="dxa"/>
+                    <w:bottom w:w="30" w:type="dxa"/>
+                    <w:right w:w="45" w:type="dxa"/>
+                  </w:tcMar>
+                  <w:vAlign w:val="bottom"/>
+                  <w:hideMark/>
+                </w:tcPr>
+                <w:p>
+                  <w:pPr>
+                    <w:rPr>
+                      <w:rFonts w:ascii="Arial" w:hAnsi="Arial" w:cs="Arial"/>
+                      <w:sz w:val="20"/>
+                      <w:szCs w:val="20"/>
+                    </w:rPr>
+                  </w:pPr>
+                  <w:r>
+                    <w:rPr>
+                      <w:rFonts w:ascii="Arial" w:hAnsi="Arial" w:cs="Arial"/>
+                      <w:sz w:val="20"/>
+                      <w:szCs w:val="20"/>
+                    </w:rPr>
+                    <w:t>Users said references to trusted sources would increase trust, so the website needed stronger source transparency.</w:t>
+                  </w:r>
+                </w:p>
+              </w:tc>
+              <w:tc>
+                <w:tcPr>
+                  <w:tcW w:w="0" w:type="auto"/>
+                  <w:tcBorders>
+                    <w:top w:val="single" w:sz="6" w:space="0" w:color="CCCCCC"/>
+                    <w:left w:val="single" w:sz="6" w:space="0" w:color="CCCCCC"/>
+                    <w:bottom w:val="single" w:sz="6" w:space="0" w:color="CCCCCC"/>
+                    <w:right w:val="single" w:sz="6" w:space="0" w:color="CCCCCC"/>
+                  </w:tcBorders>
+                  <w:tcMar>
+                    <w:top w:w="30" w:type="dxa"/>
+                    <w:left w:w="0" w:type="dxa"/>
+                    <w:bottom w:w="30" w:type="dxa"/>
+                    <w:right w:w="0" w:type="dxa"/>
+                  </w:tcMar>
+                  <w:vAlign w:val="bottom"/>
+                  <w:hideMark/>
+                </w:tcPr>
+                <w:p>
+                  <w:pPr>
+                    <w:rPr>
+                      <w:rFonts w:ascii="Arial" w:hAnsi="Arial" w:cs="Arial"/>
+                      <w:sz w:val="20"/>
+                      <w:szCs w:val="20"/>
+                    </w:rPr>
+                  </w:pPr>
+                  <w:r>
+                    <w:rPr>
+                      <w:rFonts w:ascii="Arial" w:hAnsi="Arial" w:cs="Arial"/>
+                      <w:sz w:val="20"/>
+                      <w:szCs w:val="20"/>
+                    </w:rPr>
+                    <w:t>Add a Trusted Sources page with placeholder source cards and a note that real deployment requires verified medical review.</w:t>
+                  </w:r>
+                </w:p>
+              </w:tc>
+            </w:tr>
+            <w:tr>
+              <w:trPr>
+                <w:trHeight w:val="315"/>
+              </w:trPr>
+              <w:tc>
+                <w:tcPr>
+                  <w:tcW w:w="0" w:type="auto"/>
+                  <w:tcBorders>
+                    <w:top w:val="single" w:sz="6" w:space="0" w:color="CCCCCC"/>
+                    <w:left w:val="single" w:sz="6" w:space="0" w:color="CCCCCC"/>
+                    <w:bottom w:val="single" w:sz="6" w:space="0" w:color="CCCCCC"/>
+                    <w:right w:val="single" w:sz="6" w:space="0" w:color="CCCCCC"/>
+                  </w:tcBorders>
+                  <w:tcMar>
+                    <w:top w:w="30" w:type="dxa"/>
+                    <w:left w:w="45" w:type="dxa"/>
+                    <w:bottom w:w="30" w:type="dxa"/>
+                    <w:right w:w="45" w:type="dxa"/>
+                  </w:tcMar>
+                  <w:vAlign w:val="bottom"/>
+                  <w:hideMark/>
+                </w:tcPr>
+                <w:p>
+                  <w:pPr>
+                    <w:rPr>
+                      <w:rFonts w:ascii="Arial" w:hAnsi="Arial" w:cs="Arial"/>
+                      <w:sz w:val="20"/>
+                      <w:szCs w:val="20"/>
+                    </w:rPr>
+                  </w:pPr>
+                  <w:r>
+                    <w:rPr>
+                      <w:rFonts w:ascii="Arial" w:hAnsi="Arial" w:cs="Arial"/>
+                      <w:sz w:val="20"/>
+                      <w:szCs w:val="20"/>
+                    </w:rPr>
+                    <w:t>The website did not include a full Privacy &amp; AI Limitations page.</w:t>
+                  </w:r>
+                </w:p>
+              </w:tc>
+              <w:tc>
+                <w:tcPr>
+                  <w:tcW w:w="0" w:type="auto"/>
+                  <w:tcBorders>
+                    <w:top w:val="single" w:sz="6" w:space="0" w:color="CCCCCC"/>
+                    <w:left w:val="single" w:sz="6" w:space="0" w:color="CCCCCC"/>
+                    <w:bottom w:val="single" w:sz="6" w:space="0" w:color="CCCCCC"/>
+                    <w:right w:val="single" w:sz="6" w:space="0" w:color="CCCCCC"/>
+                  </w:tcBorders>
+                  <w:tcMar>
+                    <w:top w:w="30" w:type="dxa"/>
+                    <w:left w:w="45" w:type="dxa"/>
+                    <w:bottom w:w="30" w:type="dxa"/>
+                    <w:right w:w="45" w:type="dxa"/>
+                  </w:tcMar>
+                  <w:vAlign w:val="bottom"/>
+                  <w:hideMark/>
+                </w:tcPr>
+                <w:p>
+                  <w:pPr>
+                    <w:rPr>
+                      <w:rFonts w:ascii="Arial" w:hAnsi="Arial" w:cs="Arial"/>
+                      <w:sz w:val="20"/>
+                      <w:szCs w:val="20"/>
+                    </w:rPr>
+                  </w:pPr>
+                  <w:r>
+                    <w:rPr>
+                      <w:rFonts w:ascii="Arial" w:hAnsi="Arial" w:cs="Arial"/>
+                      <w:sz w:val="20"/>
+                      <w:szCs w:val="20"/>
+                    </w:rPr>
+                    <w:t>Health-related inputs are sensitive, and users need to know how data is handled and what AI cannot do.</w:t>
+                  </w:r>
+                </w:p>
+              </w:tc>
+              <w:tc>
+                <w:tcPr>
+                  <w:tcW w:w="0" w:type="auto"/>
+                  <w:tcBorders>
+                    <w:top w:val="single" w:sz="6" w:space="0" w:color="CCCCCC"/>
+                    <w:left w:val="single" w:sz="6" w:space="0" w:color="CCCCCC"/>
+                    <w:bottom w:val="single" w:sz="6" w:space="0" w:color="CCCCCC"/>
+                    <w:right w:val="single" w:sz="6" w:space="0" w:color="CCCCCC"/>
+                  </w:tcBorders>
+                  <w:tcMar>
+                    <w:top w:w="30" w:type="dxa"/>
+                    <w:left w:w="0" w:type="dxa"/>
+                    <w:bottom w:w="30" w:type="dxa"/>
+                    <w:right w:w="0" w:type="dxa"/>
+                  </w:tcMar>
+                  <w:vAlign w:val="bottom"/>
+                  <w:hideMark/>
+                </w:tcPr>
+                <w:p>
+                  <w:pPr>
+                    <w:rPr>
+                      <w:rFonts w:ascii="Arial" w:hAnsi="Arial" w:cs="Arial"/>
+                      <w:sz w:val="20"/>
+                      <w:szCs w:val="20"/>
+                    </w:rPr>
+                  </w:pPr>
+                  <w:r>
+                    <w:rPr>
+                      <w:rFonts w:ascii="Arial" w:hAnsi="Arial" w:cs="Arial"/>
+                      <w:sz w:val="20"/>
+                      <w:szCs w:val="20"/>
+                    </w:rPr>
+                    <w:t>Add a Privacy &amp; AI Limitations page explaining no real data storage, no diagnosis, no medication recommendation, and human verification.</w:t>
+                  </w:r>
+                </w:p>
+              </w:tc>
+            </w:tr>
+            <w:tr>
+              <w:trPr>
+                <w:trHeight w:val="315"/>
+              </w:trPr>
+              <w:tc>
+                <w:tcPr>
+                  <w:tcW w:w="0" w:type="auto"/>
+                  <w:tcBorders>
+                    <w:top w:val="single" w:sz="6" w:space="0" w:color="CCCCCC"/>
+                    <w:left w:val="single" w:sz="6" w:space="0" w:color="CCCCCC"/>
+                    <w:bottom w:val="single" w:sz="6" w:space="0" w:color="CCCCCC"/>
+                    <w:right w:val="single" w:sz="6" w:space="0" w:color="CCCCCC"/>
+                  </w:tcBorders>
+                  <w:tcMar>
+                    <w:top w:w="30" w:type="dxa"/>
+                    <w:left w:w="45" w:type="dxa"/>
+                    <w:bottom w:w="30" w:type="dxa"/>
+                    <w:right w:w="45" w:type="dxa"/>
+                  </w:tcMar>
+                  <w:vAlign w:val="bottom"/>
+                  <w:hideMark/>
+                </w:tcPr>
+                <w:p>
+                  <w:pPr>
+                    <w:rPr>
+                      <w:rFonts w:ascii="Arial" w:hAnsi="Arial" w:cs="Arial"/>
+                      <w:sz w:val="20"/>
+                      <w:szCs w:val="20"/>
+                    </w:rPr>
+                  </w:pPr>
+                  <w:r>
+                    <w:rPr>
+                      <w:rFonts w:ascii="Arial" w:hAnsi="Arial" w:cs="Arial"/>
+                      <w:sz w:val="20"/>
+                      <w:szCs w:val="20"/>
+                    </w:rPr>
+                    <w:t>The form collected many personal identifiers such as name, email, and phone number.</w:t>
+                  </w:r>
+                </w:p>
+              </w:tc>
+              <w:tc>
+                <w:tcPr>
+                  <w:tcW w:w="0" w:type="auto"/>
+                  <w:tcBorders>
+                    <w:top w:val="single" w:sz="6" w:space="0" w:color="CCCCCC"/>
+                    <w:left w:val="single" w:sz="6" w:space="0" w:color="CCCCCC"/>
+                    <w:bottom w:val="single" w:sz="6" w:space="0" w:color="CCCCCC"/>
+                    <w:right w:val="single" w:sz="6" w:space="0" w:color="CCCCCC"/>
+                  </w:tcBorders>
+                  <w:tcMar>
+                    <w:top w:w="30" w:type="dxa"/>
+                    <w:left w:w="45" w:type="dxa"/>
+                    <w:bottom w:w="30" w:type="dxa"/>
+                    <w:right w:w="45" w:type="dxa"/>
+                  </w:tcMar>
+                  <w:vAlign w:val="bottom"/>
+                  <w:hideMark/>
+                </w:tcPr>
+                <w:p>
+                  <w:pPr>
+                    <w:rPr>
+                      <w:rFonts w:ascii="Arial" w:hAnsi="Arial" w:cs="Arial"/>
+                      <w:sz w:val="20"/>
+                      <w:szCs w:val="20"/>
+                    </w:rPr>
+                  </w:pPr>
+                  <w:r>
+                    <w:rPr>
+                      <w:rFonts w:ascii="Arial" w:hAnsi="Arial" w:cs="Arial"/>
+                      <w:sz w:val="20"/>
+                      <w:szCs w:val="20"/>
+                    </w:rPr>
+                    <w:t xml:space="preserve">This creates unnecessary privacy risk for a school prototype and goes beyond what is needed for </w:t>
+                  </w:r>
+                  <w:r>
+                    <w:rPr>
+                      <w:rFonts w:ascii="Arial" w:hAnsi="Arial" w:cs="Arial"/>
+                      <w:sz w:val="20"/>
+                      <w:szCs w:val="20"/>
+                    </w:rPr>
+                    <w:lastRenderedPageBreak/>
+                    <w:t>simulated symptom guidance.</w:t>
+                  </w:r>
+                </w:p>
+              </w:tc>
+              <w:tc>
+                <w:tcPr>
+                  <w:tcW w:w="0" w:type="auto"/>
+                  <w:tcBorders>
+                    <w:top w:val="single" w:sz="6" w:space="0" w:color="CCCCCC"/>
+                    <w:left w:val="single" w:sz="6" w:space="0" w:color="CCCCCC"/>
+                    <w:bottom w:val="single" w:sz="6" w:space="0" w:color="CCCCCC"/>
+                    <w:right w:val="single" w:sz="6" w:space="0" w:color="CCCCCC"/>
+                  </w:tcBorders>
+                  <w:tcMar>
+                    <w:top w:w="30" w:type="dxa"/>
+                    <w:left w:w="0" w:type="dxa"/>
+                    <w:bottom w:w="30" w:type="dxa"/>
+                    <w:right w:w="0" w:type="dxa"/>
+                  </w:tcMar>
+                  <w:vAlign w:val="bottom"/>
+                  <w:hideMark/>
+                </w:tcPr>
+                <w:p>
+                  <w:pPr>
+                    <w:rPr>
+                      <w:rFonts w:ascii="Arial" w:hAnsi="Arial" w:cs="Arial"/>
+                      <w:sz w:val="20"/>
+                      <w:szCs w:val="20"/>
+                    </w:rPr>
+                  </w:pPr>
+                  <w:r>
+                    <w:rPr>
+                      <w:rFonts w:ascii="Arial" w:hAnsi="Arial" w:cs="Arial"/>
+                      <w:sz w:val="20"/>
+                      <w:szCs w:val="20"/>
+                    </w:rPr>
+                    <w:lastRenderedPageBreak/>
+                    <w:t>Reduce unnecessary personal data collection and use age range instead of full identity details.</w:t>
+                  </w:r>
+                </w:p>
+              </w:tc>
+            </w:tr>
+            <w:tr>
+              <w:trPr>
+                <w:trHeight w:val="315"/>
+              </w:trPr>
+              <w:tc>
+                <w:tcPr>
+                  <w:tcW w:w="0" w:type="auto"/>
+                  <w:tcBorders>
+                    <w:top w:val="single" w:sz="6" w:space="0" w:color="CCCCCC"/>
+                    <w:left w:val="single" w:sz="6" w:space="0" w:color="CCCCCC"/>
+                    <w:bottom w:val="single" w:sz="6" w:space="0" w:color="CCCCCC"/>
+                    <w:right w:val="single" w:sz="6" w:space="0" w:color="CCCCCC"/>
+                  </w:tcBorders>
+                  <w:tcMar>
+                    <w:top w:w="30" w:type="dxa"/>
+                    <w:left w:w="45" w:type="dxa"/>
+                    <w:bottom w:w="30" w:type="dxa"/>
+                    <w:right w:w="45" w:type="dxa"/>
+                  </w:tcMar>
+                  <w:vAlign w:val="bottom"/>
+                  <w:hideMark/>
+                </w:tcPr>
+                <w:p>
+                  <w:pPr>
+                    <w:rPr>
+                      <w:rFonts w:ascii="Arial" w:hAnsi="Arial" w:cs="Arial"/>
+                      <w:sz w:val="20"/>
+                      <w:szCs w:val="20"/>
+                    </w:rPr>
+                  </w:pPr>
+                  <w:r>
+                    <w:rPr>
+                      <w:rFonts w:ascii="Arial" w:hAnsi="Arial" w:cs="Arial"/>
+                      <w:sz w:val="20"/>
+                      <w:szCs w:val="20"/>
+                    </w:rPr>
+                    <w:t>The website did not clearly use the group’s survey findings as design requirements.</w:t>
+                  </w:r>
+                </w:p>
+              </w:tc>
+              <w:tc>
+                <w:tcPr>
+                  <w:tcW w:w="0" w:type="auto"/>
+                  <w:tcBorders>
+                    <w:top w:val="single" w:sz="6" w:space="0" w:color="CCCCCC"/>
+                    <w:left w:val="single" w:sz="6" w:space="0" w:color="CCCCCC"/>
+                    <w:bottom w:val="single" w:sz="6" w:space="0" w:color="CCCCCC"/>
+                    <w:right w:val="single" w:sz="6" w:space="0" w:color="CCCCCC"/>
+                  </w:tcBorders>
+                  <w:tcMar>
+                    <w:top w:w="30" w:type="dxa"/>
+                    <w:left w:w="45" w:type="dxa"/>
+                    <w:bottom w:w="30" w:type="dxa"/>
+                    <w:right w:w="45" w:type="dxa"/>
+                  </w:tcMar>
+                  <w:vAlign w:val="bottom"/>
+                  <w:hideMark/>
+                </w:tcPr>
+                <w:p>
+                  <w:pPr>
+                    <w:rPr>
+                      <w:rFonts w:ascii="Arial" w:hAnsi="Arial" w:cs="Arial"/>
+                      <w:sz w:val="20"/>
+                      <w:szCs w:val="20"/>
+                    </w:rPr>
+                  </w:pPr>
+                  <w:r>
+                    <w:rPr>
+                      <w:rFonts w:ascii="Arial" w:hAnsi="Arial" w:cs="Arial"/>
+                      <w:sz w:val="20"/>
+                      <w:szCs w:val="20"/>
+                    </w:rPr>
+                    <w:t>The output was generated from the scenario only, not from the actual user research.</w:t>
+                  </w:r>
+                </w:p>
+              </w:tc>
+              <w:tc>
+                <w:tcPr>
+                  <w:tcW w:w="0" w:type="auto"/>
+                  <w:tcBorders>
+                    <w:top w:val="single" w:sz="6" w:space="0" w:color="CCCCCC"/>
+                    <w:left w:val="single" w:sz="6" w:space="0" w:color="CCCCCC"/>
+                    <w:bottom w:val="single" w:sz="6" w:space="0" w:color="CCCCCC"/>
+                    <w:right w:val="single" w:sz="6" w:space="0" w:color="CCCCCC"/>
+                  </w:tcBorders>
+                  <w:tcMar>
+                    <w:top w:w="30" w:type="dxa"/>
+                    <w:left w:w="0" w:type="dxa"/>
+                    <w:bottom w:w="30" w:type="dxa"/>
+                    <w:right w:w="0" w:type="dxa"/>
+                  </w:tcMar>
+                  <w:vAlign w:val="bottom"/>
+                  <w:hideMark/>
+                </w:tcPr>
+                <w:p>
+                  <w:pPr>
+                    <w:rPr>
+                      <w:rFonts w:ascii="Arial" w:hAnsi="Arial" w:cs="Arial"/>
+                      <w:sz w:val="20"/>
+                      <w:szCs w:val="20"/>
+                    </w:rPr>
+                  </w:pPr>
+                  <w:r>
+                    <w:rPr>
+                      <w:rFonts w:ascii="Arial" w:hAnsi="Arial" w:cs="Arial"/>
+                      <w:sz w:val="20"/>
+                      <w:szCs w:val="20"/>
+                    </w:rPr>
+                    <w:t>Include survey findings, POV statement, and initial website requirements in the next P.T.C.F. prompt.</w:t>
+                  </w:r>
+                </w:p>
+              </w:tc>
+            </w:tr>
+            <w:tr>
+              <w:trPr>
+                <w:trHeight w:val="315"/>
+              </w:trPr>
+              <w:tc>
+                <w:tcPr>
+                  <w:tcW w:w="0" w:type="auto"/>
+                  <w:tcBorders>
+                    <w:top w:val="single" w:sz="6" w:space="0" w:color="CCCCCC"/>
+                    <w:left w:val="single" w:sz="6" w:space="0" w:color="CCCCCC"/>
+                    <w:bottom w:val="single" w:sz="6" w:space="0" w:color="CCCCCC"/>
+                    <w:right w:val="single" w:sz="6" w:space="0" w:color="CCCCCC"/>
+                  </w:tcBorders>
+                  <w:tcMar>
+                    <w:top w:w="30" w:type="dxa"/>
+                    <w:left w:w="45" w:type="dxa"/>
+                    <w:bottom w:w="30" w:type="dxa"/>
+                    <w:right w:w="45" w:type="dxa"/>
+                  </w:tcMar>
+                  <w:vAlign w:val="bottom"/>
+                  <w:hideMark/>
+                </w:tcPr>
+                <w:p>
+                  <w:pPr>
+                    <w:rPr>
+                      <w:rFonts w:ascii="Arial" w:hAnsi="Arial" w:cs="Arial"/>
+                      <w:sz w:val="20"/>
+                      <w:szCs w:val="20"/>
+                    </w:rPr>
+                  </w:pPr>
+                  <w:r>
+                    <w:rPr>
+                      <w:rFonts w:ascii="Arial" w:hAnsi="Arial" w:cs="Arial"/>
+                      <w:sz w:val="20"/>
+                      <w:szCs w:val="20"/>
+                    </w:rPr>
+                    <w:t>The website was a single intake experience rather than a complete multi-page guidance prototype.</w:t>
+                  </w:r>
+                </w:p>
+              </w:tc>
+              <w:tc>
+                <w:tcPr>
+                  <w:tcW w:w="0" w:type="auto"/>
+                  <w:tcBorders>
+                    <w:top w:val="single" w:sz="6" w:space="0" w:color="CCCCCC"/>
+                    <w:left w:val="single" w:sz="6" w:space="0" w:color="CCCCCC"/>
+                    <w:bottom w:val="single" w:sz="6" w:space="0" w:color="CCCCCC"/>
+                    <w:right w:val="single" w:sz="6" w:space="0" w:color="CCCCCC"/>
+                  </w:tcBorders>
+                  <w:tcMar>
+                    <w:top w:w="30" w:type="dxa"/>
+                    <w:left w:w="45" w:type="dxa"/>
+                    <w:bottom w:w="30" w:type="dxa"/>
+                    <w:right w:w="45" w:type="dxa"/>
+                  </w:tcMar>
+                  <w:vAlign w:val="bottom"/>
+                  <w:hideMark/>
+                </w:tcPr>
+                <w:p>
+                  <w:pPr>
+                    <w:rPr>
+                      <w:rFonts w:ascii="Arial" w:hAnsi="Arial" w:cs="Arial"/>
+                      <w:sz w:val="20"/>
+                      <w:szCs w:val="20"/>
+                    </w:rPr>
+                  </w:pPr>
+                  <w:r>
+                    <w:rPr>
+                      <w:rFonts w:ascii="Arial" w:hAnsi="Arial" w:cs="Arial"/>
+                      <w:sz w:val="20"/>
+                      <w:szCs w:val="20"/>
+                    </w:rPr>
+                    <w:t>The final website needs to demonstrate a fuller user journey and stronger prototype execution.</w:t>
+                  </w:r>
+                </w:p>
+              </w:tc>
+              <w:tc>
+                <w:tcPr>
+                  <w:tcW w:w="0" w:type="auto"/>
+                  <w:tcBorders>
+                    <w:top w:val="single" w:sz="6" w:space="0" w:color="CCCCCC"/>
+                    <w:left w:val="single" w:sz="6" w:space="0" w:color="CCCCCC"/>
+                    <w:bottom w:val="single" w:sz="6" w:space="0" w:color="CCCCCC"/>
+                    <w:right w:val="single" w:sz="6" w:space="0" w:color="CCCCCC"/>
+                  </w:tcBorders>
+                  <w:tcMar>
+                    <w:top w:w="30" w:type="dxa"/>
+                    <w:left w:w="0" w:type="dxa"/>
+                    <w:bottom w:w="30" w:type="dxa"/>
+                    <w:right w:w="0" w:type="dxa"/>
+                  </w:tcMar>
+                  <w:vAlign w:val="bottom"/>
+                  <w:hideMark/>
+                </w:tcPr>
+                <w:p>
+                  <w:pPr>
+                    <w:rPr>
+                      <w:rFonts w:ascii="Arial" w:hAnsi="Arial" w:cs="Arial"/>
+                      <w:sz w:val="20"/>
+                      <w:szCs w:val="20"/>
+                    </w:rPr>
+                  </w:pPr>
+                  <w:r>
+                    <w:rPr>
+                      <w:rFonts w:ascii="Arial" w:hAnsi="Arial" w:cs="Arial"/>
+                      <w:sz w:val="20"/>
+                      <w:szCs w:val="20"/>
+                    </w:rPr>
+                    <w:t>Build pages for Home, Symptom Checker, Urgency Results, Emergency Red Flags, Human Consultation, Trusted Sources, and Privacy &amp; AI Limitations.</w:t>
+                  </w:r>
+                </w:p>
+              </w:tc>
+            </w:tr>
+            <w:tr>
+              <w:trPr>
+                <w:trHeight w:val="315"/>
+              </w:trPr>
+              <w:tc>
+                <w:tcPr>
+                  <w:tcW w:w="0" w:type="auto"/>
+                  <w:tcBorders>
+                    <w:top w:val="single" w:sz="6" w:space="0" w:color="CCCCCC"/>
+                    <w:left w:val="single" w:sz="6" w:space="0" w:color="CCCCCC"/>
+                    <w:bottom w:val="single" w:sz="6" w:space="0" w:color="CCCCCC"/>
+                    <w:right w:val="single" w:sz="6" w:space="0" w:color="CCCCCC"/>
+                  </w:tcBorders>
+                  <w:tcMar>
+                    <w:top w:w="30" w:type="dxa"/>
+                    <w:left w:w="45" w:type="dxa"/>
+                    <w:bottom w:w="30" w:type="dxa"/>
+                    <w:right w:w="45" w:type="dxa"/>
+                  </w:tcMar>
+                  <w:vAlign w:val="bottom"/>
+                  <w:hideMark/>
+                </w:tcPr>
+                <w:p>
+                  <w:pPr>
+                    <w:rPr>
+                      <w:rFonts w:ascii="Arial" w:hAnsi="Arial" w:cs="Arial"/>
+                      <w:sz w:val="20"/>
+                      <w:szCs w:val="20"/>
+                    </w:rPr>
+                  </w:pPr>
+                  <w:r>
+                    <w:rPr>
+                      <w:rFonts w:ascii="Arial" w:hAnsi="Arial" w:cs="Arial"/>
+                      <w:sz w:val="20"/>
+                      <w:szCs w:val="20"/>
+                    </w:rPr>
+                    <w:t xml:space="preserve">The website avoided automated diagnosis and drug </w:t>
+                  </w:r>
+                  <w:proofErr w:type="gramStart"/>
+                  <w:r>
+                    <w:rPr>
+                      <w:rFonts w:ascii="Arial" w:hAnsi="Arial" w:cs="Arial"/>
+                      <w:sz w:val="20"/>
+                      <w:szCs w:val="20"/>
+                    </w:rPr>
+                    <w:t>recommendation, but</w:t>
+                  </w:r>
+                  <w:proofErr w:type="gramEnd"/>
+                  <w:r>
+                    <w:rPr>
+                      <w:rFonts w:ascii="Arial" w:hAnsi="Arial" w:cs="Arial"/>
+                      <w:sz w:val="20"/>
+                      <w:szCs w:val="20"/>
+                    </w:rPr>
+                    <w:t xml:space="preserve"> did not replace them with a clear safe alternative.</w:t>
+                  </w:r>
+                </w:p>
+              </w:tc>
+              <w:tc>
+                <w:tcPr>
+                  <w:tcW w:w="0" w:type="auto"/>
+                  <w:tcBorders>
+                    <w:top w:val="single" w:sz="6" w:space="0" w:color="CCCCCC"/>
+                    <w:left w:val="single" w:sz="6" w:space="0" w:color="CCCCCC"/>
+                    <w:bottom w:val="single" w:sz="6" w:space="0" w:color="CCCCCC"/>
+                    <w:right w:val="single" w:sz="6" w:space="0" w:color="CCCCCC"/>
+                  </w:tcBorders>
+                  <w:tcMar>
+                    <w:top w:w="30" w:type="dxa"/>
+                    <w:left w:w="45" w:type="dxa"/>
+                    <w:bottom w:w="30" w:type="dxa"/>
+                    <w:right w:w="45" w:type="dxa"/>
+                  </w:tcMar>
+                  <w:vAlign w:val="bottom"/>
+                  <w:hideMark/>
+                </w:tcPr>
+                <w:p>
+                  <w:pPr>
+                    <w:rPr>
+                      <w:rFonts w:ascii="Arial" w:hAnsi="Arial" w:cs="Arial"/>
+                      <w:sz w:val="20"/>
+                      <w:szCs w:val="20"/>
+                    </w:rPr>
+                  </w:pPr>
+                  <w:r>
+                    <w:rPr>
+                      <w:rFonts w:ascii="Arial" w:hAnsi="Arial" w:cs="Arial"/>
+                      <w:sz w:val="20"/>
+                      <w:szCs w:val="20"/>
+                    </w:rPr>
+                    <w:t>Avoiding unsafe advice was good, but the output still needed a positive solution that helped users understand what to do next.</w:t>
+                  </w:r>
+                </w:p>
+              </w:tc>
+              <w:tc>
+                <w:tcPr>
+                  <w:tcW w:w="0" w:type="auto"/>
+                  <w:tcBorders>
+                    <w:top w:val="single" w:sz="6" w:space="0" w:color="CCCCCC"/>
+                    <w:left w:val="single" w:sz="6" w:space="0" w:color="CCCCCC"/>
+                    <w:bottom w:val="single" w:sz="6" w:space="0" w:color="CCCCCC"/>
+                    <w:right w:val="single" w:sz="6" w:space="0" w:color="CCCCCC"/>
+                  </w:tcBorders>
+                  <w:tcMar>
+                    <w:top w:w="30" w:type="dxa"/>
+                    <w:left w:w="0" w:type="dxa"/>
+                    <w:bottom w:w="30" w:type="dxa"/>
+                    <w:right w:w="0" w:type="dxa"/>
+                  </w:tcMar>
+                  <w:vAlign w:val="bottom"/>
+                  <w:hideMark/>
+                </w:tcPr>
+                <w:p>
+                  <w:pPr>
+                    <w:rPr>
+                      <w:rFonts w:ascii="Arial" w:hAnsi="Arial" w:cs="Arial"/>
+                      <w:sz w:val="20"/>
+                      <w:szCs w:val="20"/>
+                    </w:rPr>
+                  </w:pPr>
+                  <w:r>
+                    <w:rPr>
+                      <w:rFonts w:ascii="Arial" w:hAnsi="Arial" w:cs="Arial"/>
+                      <w:sz w:val="20"/>
+                      <w:szCs w:val="20"/>
+                    </w:rPr>
+                    <w:t>Replace diagnosis and medication advice with urgency-based guidance, red-flag warnings, and human consultation recommendations.</w:t>
+                  </w:r>
+                </w:p>
+              </w:tc>
+            </w:tr>
+          </w:tbl>
+          <w:p>
+            <w:pPr>
+              <w:pStyle w:val="Normal1"/>
+            </w:pPr>
+          </w:p>
+        </w:tc>
+        <w:tc>
+          <w:tcPr>
+            <w:tcW w:w="4411" w:type="dxa"/>
+          </w:tcPr>
+          <w:p>
+            <w:pPr>
+              <w:pStyle w:val="Normal1"/>
+            </w:pPr>
+          </w:p>
+        </w:tc>
+      </w:tr>
+    </w:tbl>
+    <w:p>
+      <w:pPr>
+        <w:pStyle w:val="Normal1"/>
+      </w:pPr>
+    </w:p>
+    <w:p>
+      <w:pPr>
+        <w:pStyle w:val="Normal1"/>
+      </w:pPr>
+      <w:r>
+        <w:t xml:space="preserve">Overall, the zero-shot prompt produced a starting point better than I expected, especially visually. However, it also showed why structured prompting was necessary. Codex avoided the most unsafe part of the prompt by not providing automated diagnoses or medication recommendations, but the generated website was not fully functional because the “Generate Visit Summary” button did not produce the expected output. The prototype also lacked important research-based </w:t>
+      </w:r>
+      <w:proofErr w:type="spellStart"/>
+      <w:r>
+        <w:t>requirerments</w:t>
+      </w:r>
+      <w:proofErr w:type="spellEnd"/>
+      <w:r>
+        <w:t xml:space="preserve"> such as urgency guidance, emergency red flags, trusted sources, privacy transparency, reduced personal data collection, and a complete multi-page user journey. This confirmed that the next stage needed a more detailed PTCF prompt supported by </w:t>
+      </w:r>
+      <w:proofErr w:type="spellStart"/>
+      <w:r>
+        <w:t>vibecoding</w:t>
+      </w:r>
+      <w:proofErr w:type="spellEnd"/>
+      <w:r>
+        <w:t xml:space="preserve"> planning documents to control both the product direction and the technical implementation more intentionally.</w:t>
+      </w:r>
+    </w:p>
+    <w:p>
+      <w:pPr>
+        <w:spacing w:line="276" w:lineRule="auto"/>
+        <w:ind w:left="720"/>
+        <w:rPr>
+          <w:rFonts w:ascii="Arial" w:hAnsi="Arial" w:cs="Arial"/>
+          <w:sz w:val="22"/>
+          <w:szCs w:val="22"/>
+        </w:rPr>
+      </w:pPr>
+    </w:p>
+    <w:p>
+      <w:pPr>
         <w:spacing w:line="276" w:lineRule="auto"/>
         <w:rPr>
           <w:rFonts w:ascii="Arial" w:hAnsi="Arial" w:cs="Arial"/>
@@ -4676,7 +7008,7 @@
           <w:sz w:val="22"/>
           <w:szCs w:val="22"/>
         </w:rPr>
-        <w:t>The Diagnostic Log:</w:t>
+        <w:t>The Synthesis Protocol:</w:t>
       </w:r>
       <w:r>
         <w:rPr>
@@ -4690,7 +7022,7 @@
     <w:p>
       <w:pPr>
         <w:spacing w:line="276" w:lineRule="auto"/>
-        <w:ind w:left="720"/>
+        <w:ind w:left="1440"/>
         <w:rPr>
           <w:rFonts w:ascii="Arial" w:hAnsi="Arial" w:cs="Arial"/>
           <w:sz w:val="22"/>
@@ -4700,10 +7032,6 @@
     </w:p>
     <w:p>
       <w:pPr>
-        <w:numPr>
-          <w:ilvl w:val="0"/>
-          <w:numId w:val="11"/>
-        </w:numPr>
         <w:spacing w:line="276" w:lineRule="auto"/>
         <w:rPr>
           <w:rFonts w:ascii="Arial" w:hAnsi="Arial" w:cs="Arial"/>
@@ -4719,7 +7047,7 @@
           <w:sz w:val="22"/>
           <w:szCs w:val="22"/>
         </w:rPr>
-        <w:t>The Synthesis Protocol:</w:t>
+        <w:t>The Mindful Creator Audit:</w:t>
       </w:r>
       <w:r>
         <w:rPr>
@@ -4732,57 +7060,14 @@
     </w:p>
     <w:p>
       <w:pPr>
-        <w:spacing w:line="276" w:lineRule="auto"/>
-        <w:ind w:left="1440"/>
-        <w:rPr>
-          <w:rFonts w:ascii="Arial" w:hAnsi="Arial" w:cs="Arial"/>
-          <w:sz w:val="22"/>
-          <w:szCs w:val="22"/>
-        </w:rPr>
-      </w:pPr>
-    </w:p>
-    <w:p>
-      <w:pPr>
-        <w:numPr>
-          <w:ilvl w:val="0"/>
-          <w:numId w:val="11"/>
-        </w:numPr>
-        <w:spacing w:line="276" w:lineRule="auto"/>
-        <w:rPr>
-          <w:rFonts w:ascii="Arial" w:hAnsi="Arial" w:cs="Arial"/>
-          <w:sz w:val="22"/>
-          <w:szCs w:val="22"/>
-        </w:rPr>
-      </w:pPr>
-      <w:r>
-        <w:rPr>
-          <w:rFonts w:ascii="Arial" w:hAnsi="Arial" w:cs="Arial"/>
-          <w:b/>
+        <w:rPr>
           <w:bCs/>
-          <w:sz w:val="22"/>
-          <w:szCs w:val="22"/>
-        </w:rPr>
-        <w:t>The Mindful Creator Audit:</w:t>
-      </w:r>
-      <w:r>
-        <w:rPr>
-          <w:rFonts w:ascii="Arial" w:hAnsi="Arial" w:cs="Arial"/>
-          <w:sz w:val="22"/>
-          <w:szCs w:val="22"/>
-        </w:rPr>
-        <w:t xml:space="preserve"> </w:t>
-      </w:r>
-    </w:p>
-    <w:p>
-      <w:pPr>
-        <w:rPr>
-          <w:bCs/>
         </w:rPr>
       </w:pPr>
     </w:p>
     <w:sectPr>
-      <w:headerReference w:type="default" r:id="rId23"/>
-      <w:footerReference w:type="default" r:id="rId24"/>
+      <w:headerReference w:type="default" r:id="rId29"/>
+      <w:footerReference w:type="default" r:id="rId30"/>
       <w:pgSz w:w="11906" w:h="16838"/>
       <w:pgMar w:top="1440" w:right="1274" w:bottom="1440" w:left="1800" w:header="720" w:footer="720" w:gutter="0"/>
       <w:cols w:space="720"/>

</xml_diff>